<commit_message>
Redacción actualizada a 31/1/26
</commit_message>
<xml_diff>
--- a/Proxecto.docx
+++ b/Proxecto.docx
@@ -13,6 +13,60 @@
       </w:r>
       <w:bookmarkEnd w:id="0"/>
       <w:bookmarkEnd w:id="1"/>
+      <w:r>
+        <w:br w:type="page"/>
+      </w:r>
+    </w:p>
+    <w:p>
+      <w:pPr>
+        <w:jc w:val="left"/>
+      </w:pPr>
+      <w:r>
+        <w:lastRenderedPageBreak/>
+        <w:t>Resumo</w:t>
+      </w:r>
+    </w:p>
+    <w:p>
+      <w:pPr>
+        <w:jc w:val="left"/>
+      </w:pPr>
+      <w:r>
+        <w:t>Palabras chave</w:t>
+      </w:r>
+    </w:p>
+    <w:p>
+      <w:pPr>
+        <w:jc w:val="left"/>
+      </w:pPr>
+      <w:proofErr w:type="spellStart"/>
+      <w:r>
+        <w:t>Abstract</w:t>
+      </w:r>
+      <w:proofErr w:type="spellEnd"/>
+    </w:p>
+    <w:p>
+      <w:pPr>
+        <w:jc w:val="left"/>
+        <w:rPr>
+          <w:rFonts w:ascii="Redzone" w:hAnsi="Redzone" w:cstheme="minorHAnsi"/>
+          <w:caps/>
+          <w:sz w:val="36"/>
+          <w:szCs w:val="36"/>
+        </w:rPr>
+      </w:pPr>
+      <w:proofErr w:type="spellStart"/>
+      <w:r>
+        <w:t>Key</w:t>
+      </w:r>
+      <w:proofErr w:type="spellEnd"/>
+      <w:r>
+        <w:t xml:space="preserve"> </w:t>
+      </w:r>
+      <w:proofErr w:type="spellStart"/>
+      <w:r>
+        <w:t>Words</w:t>
+      </w:r>
+      <w:proofErr w:type="spellEnd"/>
       <w:r>
         <w:br w:type="page"/>
       </w:r>
@@ -945,7 +999,67 @@
         <w:pStyle w:val="Textodocorpo"/>
       </w:pPr>
       <w:r>
-        <w:t xml:space="preserve">O consumo enerxético en vivendas é un factor importante a ter en conta no proceso de transición enerxética. Por isto, planificar a construción e reforma de vivendas para mellorar a eficiencia enerxética é chave no proceso de descarbonización da nosa sociedade. </w:t>
+        <w:t xml:space="preserve">Na Galiza o consumo enerxético total foi de 4.869 </w:t>
+      </w:r>
+      <w:proofErr w:type="spellStart"/>
+      <w:r>
+        <w:t>ktep</w:t>
+      </w:r>
+      <w:proofErr w:type="spellEnd"/>
+      <w:r>
+        <w:rPr>
+          <w:rStyle w:val="Referenciadenotaaopdepxina"/>
+        </w:rPr>
+        <w:footnoteReference w:id="1"/>
+      </w:r>
+      <w:r>
+        <w:t xml:space="preserve"> dos cales as vivendas galegas representaron 699 </w:t>
+      </w:r>
+      <w:proofErr w:type="spellStart"/>
+      <w:r>
+        <w:t>ktep</w:t>
+      </w:r>
+      <w:proofErr w:type="spellEnd"/>
+      <w:r>
+        <w:t xml:space="preserve">, o 14,4% </w:t>
+      </w:r>
+      <w:sdt>
+        <w:sdtPr>
+          <w:id w:val="-1598781946"/>
+          <w:citation/>
+        </w:sdtPr>
+        <w:sdtContent>
+          <w:r>
+            <w:fldChar w:fldCharType="begin"/>
+          </w:r>
+          <w:r>
+            <w:instrText xml:space="preserve"> CITATION INE25 \l 1110 </w:instrText>
+          </w:r>
+          <w:r>
+            <w:fldChar w:fldCharType="separate"/>
+          </w:r>
+          <w:r>
+            <w:rPr>
+              <w:noProof/>
+            </w:rPr>
+            <w:t>(INEGA, 2025)</w:t>
+          </w:r>
+          <w:r>
+            <w:fldChar w:fldCharType="end"/>
+          </w:r>
+        </w:sdtContent>
+      </w:sdt>
+      <w:r>
+        <w:t>. Por isto, o</w:t>
+      </w:r>
+      <w:r>
+        <w:t xml:space="preserve"> consumo enerxético en vivendas é un factor importante a ter en conta no proceso de transición enerxética. </w:t>
+      </w:r>
+      <w:r>
+        <w:t>Así mesmo</w:t>
+      </w:r>
+      <w:r>
+        <w:t xml:space="preserve">, planificar a construción e reforma de vivendas para mellorar a eficiencia enerxética é chave no proceso de descarbonización da nosa sociedade. </w:t>
       </w:r>
     </w:p>
     <w:p>
@@ -958,50 +1072,88 @@
         <w:pStyle w:val="Textodocorpo"/>
       </w:pPr>
       <w:r>
-        <w:t>Por isto, este proxecto analizaremos as distintas variables que inflúen de xeito directo no consumo dos fogares e procuraremos métodos de minimizar o gasto enerxético. Con este obxectivo construiremos un prototipo que simule as condicións dunha vivenda. Analizaremos distintas variables do entorno para determinarmos cal é máis óptima en canto ao consumo se refire. Formularemos múltiples escenarios para comparar distintos materiais illantes ou condicións térmicas e así propoñer alternativas ao modelo actual que poderían reducir o emprego de enerxía. Tamén fabricaremos un sistema dixital usando un microcontrolador Arduino e diferentes sensores.</w:t>
+        <w:t xml:space="preserve">Por isto, </w:t>
+      </w:r>
+      <w:r>
+        <w:t>n</w:t>
+      </w:r>
+      <w:r>
+        <w:t>este proxecto analizaremos as distintas variables que inflúen de xeito directo no consumo dos fogares</w:t>
+      </w:r>
+      <w:r>
+        <w:t>. Con este obxectivo construiremos un prototipo que simule as condicións dunha vivenda</w:t>
+      </w:r>
+      <w:r>
+        <w:t xml:space="preserve"> para a</w:t>
+      </w:r>
+      <w:r>
+        <w:t>naliz</w:t>
+      </w:r>
+      <w:r>
+        <w:t>a</w:t>
+      </w:r>
+      <w:r>
+        <w:t>r</w:t>
+      </w:r>
+      <w:r>
+        <w:t>mo</w:t>
+      </w:r>
+      <w:r>
+        <w:t>s as</w:t>
+      </w:r>
+      <w:r>
+        <w:t xml:space="preserve"> </w:t>
+      </w:r>
+      <w:r>
+        <w:t xml:space="preserve">distintas variables do entorno para determinarmos </w:t>
+      </w:r>
+      <w:r>
+        <w:t>que configuración de materias e illamento é mellor</w:t>
+      </w:r>
+      <w:r>
+        <w:rPr>
+          <w:color w:val="EE0000"/>
+        </w:rPr>
+        <w:t xml:space="preserve"> </w:t>
+      </w:r>
+      <w:r>
+        <w:t xml:space="preserve">en canto ao consumo se refire. Formularemos múltiples escenarios para comparar distintos materiais illantes ou condicións térmicas e </w:t>
+      </w:r>
+      <w:r>
+        <w:t>ter a capacidade de estudalos e propo</w:t>
+      </w:r>
+      <w:r>
+        <w:t xml:space="preserve">ñer alternativas ao modelo actual </w:t>
+      </w:r>
+      <w:r>
+        <w:t>e</w:t>
+      </w:r>
+      <w:r>
+        <w:t xml:space="preserve"> </w:t>
+      </w:r>
+      <w:r>
+        <w:t xml:space="preserve">así </w:t>
+      </w:r>
+      <w:r>
+        <w:t>poder</w:t>
+      </w:r>
+      <w:r>
+        <w:t xml:space="preserve"> reducir o </w:t>
+      </w:r>
+      <w:r>
+        <w:t>consumo</w:t>
+      </w:r>
+      <w:r>
+        <w:t xml:space="preserve"> de enerxía. Tamén fabricaremos un sistema dixital usando un microcontrolador Arduino e diferentes sensores</w:t>
+      </w:r>
+      <w:r>
+        <w:t>, para así podermos realizar as recolleitas de datos que se poidan precisar.</w:t>
       </w:r>
     </w:p>
     <w:p>
       <w:pPr>
         <w:pStyle w:val="Textodocorpo"/>
       </w:pPr>
-    </w:p>
-    <w:p>
-      <w:pPr>
-        <w:pStyle w:val="Textodocorpo"/>
-        <w:rPr>
-          <w:ins w:id="3" w:author="Saúl Cid" w:date="2025-12-29T17:01:00Z" w16du:dateUtc="2025-12-29T16:01:00Z"/>
-          <w:i/>
-          <w:iCs/>
-        </w:rPr>
-      </w:pPr>
-      <w:ins w:id="4" w:author="Saúl Cid" w:date="2025-12-29T17:01:00Z" w16du:dateUtc="2025-12-29T16:01:00Z">
-        <w:r>
-          <w:rPr>
-            <w:i/>
-            <w:iCs/>
-          </w:rPr>
-          <w:t>Se da tempo a facelo:</w:t>
-        </w:r>
-      </w:ins>
-    </w:p>
-    <w:p>
-      <w:pPr>
-        <w:pStyle w:val="Textodocorpo"/>
-        <w:rPr>
-          <w:ins w:id="5" w:author="Saúl Cid" w:date="2025-12-29T17:01:00Z" w16du:dateUtc="2025-12-29T16:01:00Z"/>
-        </w:rPr>
-      </w:pPr>
-    </w:p>
-    <w:p>
-      <w:pPr>
-        <w:pStyle w:val="Textodocorpo"/>
-      </w:pPr>
-      <w:ins w:id="6" w:author="Saúl Cid" w:date="2025-12-29T17:01:00Z" w16du:dateUtc="2025-12-29T16:01:00Z">
-        <w:r>
-          <w:t>Despois da toma de datos compararemos as diferentes tomas de datos e analizaremos os resultados obtidos comparando tódolos resultados. Para determinar así as como incorporar o prototipo ou como melloralo.</w:t>
-        </w:r>
-      </w:ins>
       <w:r>
         <w:br w:type="page"/>
       </w:r>
@@ -1010,19 +1162,48 @@
       <w:pPr>
         <w:pStyle w:val="Ttulo2"/>
       </w:pPr>
-      <w:bookmarkStart w:id="7" w:name="_Toc217920023"/>
+      <w:bookmarkStart w:id="3" w:name="_Toc217920023"/>
       <w:r>
         <w:lastRenderedPageBreak/>
         <w:t>Estado do coñecemento</w:t>
       </w:r>
-      <w:bookmarkEnd w:id="7"/>
+      <w:bookmarkEnd w:id="3"/>
     </w:p>
     <w:p>
       <w:pPr>
         <w:pStyle w:val="Textodocorpo"/>
       </w:pPr>
       <w:r>
-        <w:t>Hoxe en día, a crise climática supón un punto de inflexión no noso xeito de vivir, pensar e consumir. O uso excesivo de combustibles fósiles é directamente responsábel desta emerxencia. É por isto que reducir a cantidade de enerxía que producimos ou consumimos innecesariamente é chave para paliar os efectos que a crise climática terá nas nosas vidas.</w:t>
+        <w:t>Hoxe en día, a crise climática supón un punto de inflexión no noso xeito de vivir</w:t>
+      </w:r>
+      <w:sdt>
+        <w:sdtPr>
+          <w:id w:val="451207680"/>
+          <w:citation/>
+        </w:sdtPr>
+        <w:sdtContent>
+          <w:r>
+            <w:fldChar w:fldCharType="begin"/>
+          </w:r>
+          <w:r>
+            <w:instrText xml:space="preserve"> CITATION Zam15 \l 1110 </w:instrText>
+          </w:r>
+          <w:r>
+            <w:fldChar w:fldCharType="separate"/>
+          </w:r>
+          <w:r>
+            <w:rPr>
+              <w:noProof/>
+            </w:rPr>
+            <w:t xml:space="preserve"> (Zamora Martínez, 2015)</w:t>
+          </w:r>
+          <w:r>
+            <w:fldChar w:fldCharType="end"/>
+          </w:r>
+        </w:sdtContent>
+      </w:sdt>
+      <w:r>
+        <w:t>, pensar e consumir. O uso excesivo de combustibles fósiles é directamente responsábel desta emerxencia. É por isto que reducir a cantidade de enerxía que producimos ou consumimos innecesariamente é chave para paliar os efectos que a crise climática terá nas nosas vidas.</w:t>
       </w:r>
     </w:p>
     <w:p>
@@ -1051,6 +1232,7 @@
           <w:id w:val="-99573613"/>
           <w:citation/>
         </w:sdtPr>
+        <w:sdtEndPr/>
         <w:sdtContent>
           <w:r>
             <w:fldChar w:fldCharType="begin"/>
@@ -1085,7 +1267,13 @@
         <w:t xml:space="preserve">) e a auga quente sanitaria (18,9%) na media do estado. </w:t>
       </w:r>
       <w:r>
-        <w:t>Na Galiza (Zona Atlántica) as respectivas porcentaxe son de 40,1% e 21,9%.</w:t>
+        <w:t>Na Galiza (Zona Atlántica) as respectivas porcentaxe son d</w:t>
+      </w:r>
+      <w:r>
+        <w:t>o</w:t>
+      </w:r>
+      <w:r>
+        <w:t xml:space="preserve"> 40,1% e 21,9%.</w:t>
       </w:r>
     </w:p>
     <w:p>
@@ -1115,7 +1303,36 @@
         <w:t>varias</w:t>
       </w:r>
       <w:r>
-        <w:t xml:space="preserve"> formas:</w:t>
+        <w:t xml:space="preserve"> formas</w:t>
+      </w:r>
+      <w:sdt>
+        <w:sdtPr>
+          <w:id w:val="602387329"/>
+          <w:citation/>
+        </w:sdtPr>
+        <w:sdtContent>
+          <w:r>
+            <w:fldChar w:fldCharType="begin"/>
+          </w:r>
+          <w:r>
+            <w:instrText xml:space="preserve"> CITATION Man83 \l 1110 </w:instrText>
+          </w:r>
+          <w:r>
+            <w:fldChar w:fldCharType="separate"/>
+          </w:r>
+          <w:r>
+            <w:rPr>
+              <w:noProof/>
+            </w:rPr>
+            <w:t xml:space="preserve"> (Margarida, 1983)</w:t>
+          </w:r>
+          <w:r>
+            <w:fldChar w:fldCharType="end"/>
+          </w:r>
+        </w:sdtContent>
+      </w:sdt>
+      <w:r>
+        <w:t>:</w:t>
       </w:r>
     </w:p>
     <w:p>
@@ -1129,6 +1346,9 @@
       <w:r>
         <w:t>Convección</w:t>
       </w:r>
+      <w:r>
+        <w:t xml:space="preserve"> </w:t>
+      </w:r>
     </w:p>
     <w:p>
       <w:pPr>
@@ -1139,7 +1359,27 @@
         </w:numPr>
       </w:pPr>
       <w:r>
+        <w:t>Radiación</w:t>
+      </w:r>
+    </w:p>
+    <w:p>
+      <w:pPr>
+        <w:pStyle w:val="Textodocorpo"/>
+        <w:numPr>
+          <w:ilvl w:val="0"/>
+          <w:numId w:val="6"/>
+        </w:numPr>
+      </w:pPr>
+      <w:r>
         <w:t>Condución</w:t>
+      </w:r>
+    </w:p>
+    <w:p>
+      <w:pPr>
+        <w:pStyle w:val="Textodocorpo"/>
+      </w:pPr>
+      <w:r>
+        <w:t>No noso caso centrarémonos nos dous primeiros casos que son os que afectarán e maior grao o noso prototipo.</w:t>
       </w:r>
     </w:p>
     <w:p>
@@ -1176,12 +1416,17 @@
       <w:r>
         <w:t>é a transferencia de calor por movemento de fluídos. O fluxo de calor recibido pola superficie dun corpo (</w:t>
       </w:r>
-      <w:r>
-        <w:rPr>
-          <w:rFonts w:cs="Arial"/>
-        </w:rPr>
-        <w:t>Φ</w:t>
-      </w:r>
+      <m:oMath>
+        <m:r>
+          <m:rPr>
+            <m:sty m:val="p"/>
+          </m:rPr>
+          <w:rPr>
+            <w:rFonts w:ascii="Cambria Math" w:hAnsi="Cambria Math"/>
+          </w:rPr>
+          <m:t>Φ</m:t>
+        </m:r>
+      </m:oMath>
       <w:r>
         <w:t>) é proporcional á diferencia de temperatura, ambiental (t</w:t>
       </w:r>
@@ -1219,6 +1464,7 @@
     <w:p>
       <w:pPr>
         <w:pStyle w:val="Textodocorpo"/>
+        <w:keepNext/>
         <w:ind w:left="709"/>
       </w:pPr>
       <m:oMathPara>
@@ -1364,6 +1610,25 @@
     </w:p>
     <w:p>
       <w:pPr>
+        <w:pStyle w:val="Lenda"/>
+        <w:jc w:val="right"/>
+      </w:pPr>
+      <w:bookmarkStart w:id="4" w:name="_Toc220770995"/>
+      <w:r>
+        <w:t xml:space="preserve">Ecuación </w:t>
+      </w:r>
+      <w:fldSimple w:instr=" SEQ Ecuación \* ARABIC ">
+        <w:r>
+          <w:rPr>
+            <w:noProof/>
+          </w:rPr>
+          <w:t>1</w:t>
+        </w:r>
+        <w:bookmarkEnd w:id="4"/>
+      </w:fldSimple>
+    </w:p>
+    <w:p>
+      <w:pPr>
         <w:pStyle w:val="Textodocorpo"/>
         <w:ind w:left="709"/>
       </w:pPr>
@@ -1390,7 +1655,11 @@
         <w:t>convección natural</w:t>
       </w:r>
       <w:r>
-        <w:t xml:space="preserve"> mais, cando é causado por correntes de aire derivadas de apertura de portas, movemento de obxectos, etc. chámase </w:t>
+        <w:t xml:space="preserve"> mais, cando é causado por correntes de aire </w:t>
+      </w:r>
+      <w:r>
+        <w:lastRenderedPageBreak/>
+        <w:t xml:space="preserve">derivadas de apertura de portas, movemento de obxectos, etc. chámase </w:t>
       </w:r>
       <w:r>
         <w:rPr>
@@ -1417,8 +1686,7 @@
         <w:pStyle w:val="Ttulo3"/>
       </w:pPr>
       <w:r>
-        <w:lastRenderedPageBreak/>
-        <w:t>Condución</w:t>
+        <w:t>Radiación</w:t>
       </w:r>
     </w:p>
     <w:p>
@@ -1432,16 +1700,296 @@
         <w:pStyle w:val="Textodocorpo"/>
         <w:ind w:left="709"/>
       </w:pPr>
+      <w:r>
+        <w:t>Todo corpo máis quente que outro cede parte da súa enerxía calorífica. A cantidade de calor recibida é proporcional á diferencia de temperaturas (</w:t>
+      </w:r>
+      <m:oMath>
+        <m:sSub>
+          <m:sSubPr>
+            <m:ctrlPr>
+              <w:rPr>
+                <w:rFonts w:ascii="Cambria Math" w:hAnsi="Cambria Math"/>
+                <w:i/>
+              </w:rPr>
+            </m:ctrlPr>
+          </m:sSubPr>
+          <m:e>
+            <m:r>
+              <w:rPr>
+                <w:rFonts w:ascii="Cambria Math" w:hAnsi="Cambria Math"/>
+              </w:rPr>
+              <m:t>t</m:t>
+            </m:r>
+          </m:e>
+          <m:sub>
+            <m:r>
+              <w:rPr>
+                <w:rFonts w:ascii="Cambria Math" w:hAnsi="Cambria Math"/>
+              </w:rPr>
+              <m:t>1</m:t>
+            </m:r>
+          </m:sub>
+        </m:sSub>
+        <m:r>
+          <w:rPr>
+            <w:rFonts w:ascii="Cambria Math" w:hAnsi="Cambria Math"/>
+          </w:rPr>
+          <m:t>-</m:t>
+        </m:r>
+        <m:sSub>
+          <m:sSubPr>
+            <m:ctrlPr>
+              <w:rPr>
+                <w:rFonts w:ascii="Cambria Math" w:hAnsi="Cambria Math"/>
+                <w:i/>
+              </w:rPr>
+            </m:ctrlPr>
+          </m:sSubPr>
+          <m:e>
+            <m:r>
+              <w:rPr>
+                <w:rFonts w:ascii="Cambria Math" w:hAnsi="Cambria Math"/>
+              </w:rPr>
+              <m:t>t</m:t>
+            </m:r>
+          </m:e>
+          <m:sub>
+            <m:r>
+              <w:rPr>
+                <w:rFonts w:ascii="Cambria Math" w:hAnsi="Cambria Math"/>
+              </w:rPr>
+              <m:t>2</m:t>
+            </m:r>
+          </m:sub>
+        </m:sSub>
+      </m:oMath>
+      <w:r>
+        <w:t>); a un coeficiente de cambio superficial por radiación (</w:t>
+      </w:r>
+      <m:oMath>
+        <m:sSub>
+          <m:sSubPr>
+            <m:ctrlPr>
+              <w:rPr>
+                <w:rFonts w:ascii="Cambria Math" w:hAnsi="Cambria Math" w:cs="Arial"/>
+                <w:i/>
+              </w:rPr>
+            </m:ctrlPr>
+          </m:sSubPr>
+          <m:e>
+            <m:r>
+              <w:rPr>
+                <w:rFonts w:ascii="Cambria Math" w:hAnsi="Cambria Math" w:cs="Arial"/>
+              </w:rPr>
+              <m:t>α</m:t>
+            </m:r>
+          </m:e>
+          <m:sub>
+            <m:r>
+              <w:rPr>
+                <w:rFonts w:ascii="Cambria Math" w:hAnsi="Cambria Math" w:cs="Arial"/>
+              </w:rPr>
+              <m:t>R</m:t>
+            </m:r>
+          </m:sub>
+        </m:sSub>
+      </m:oMath>
+      <w:r>
+        <w:t>); e a un factor de forma (</w:t>
+      </w:r>
+      <m:oMath>
+        <m:r>
+          <w:rPr>
+            <w:rFonts w:ascii="Cambria Math" w:hAnsi="Cambria Math"/>
+          </w:rPr>
+          <m:t>f</m:t>
+        </m:r>
+      </m:oMath>
+      <w:r>
+        <w:t>).</w:t>
+      </w:r>
     </w:p>
     <w:p>
       <w:pPr>
         <w:pStyle w:val="Textodocorpo"/>
-      </w:pPr>
+        <w:keepNext/>
+        <w:ind w:left="709"/>
+      </w:pPr>
+      <m:oMathPara>
+        <m:oMath>
+          <m:sSub>
+            <m:sSubPr>
+              <m:ctrlPr>
+                <w:rPr>
+                  <w:rFonts w:ascii="Cambria Math" w:hAnsi="Cambria Math"/>
+                </w:rPr>
+              </m:ctrlPr>
+            </m:sSubPr>
+            <m:e>
+              <m:r>
+                <m:rPr>
+                  <m:sty m:val="p"/>
+                </m:rPr>
+                <w:rPr>
+                  <w:rFonts w:ascii="Cambria Math" w:hAnsi="Cambria Math"/>
+                </w:rPr>
+                <m:t>Φ</m:t>
+              </m:r>
+            </m:e>
+            <m:sub>
+              <m:r>
+                <w:rPr>
+                  <w:rFonts w:ascii="Cambria Math" w:hAnsi="Cambria Math"/>
+                </w:rPr>
+                <m:t>R</m:t>
+              </m:r>
+            </m:sub>
+          </m:sSub>
+          <m:r>
+            <w:rPr>
+              <w:rFonts w:ascii="Cambria Math" w:hAnsi="Cambria Math"/>
+            </w:rPr>
+            <m:t>=</m:t>
+          </m:r>
+          <m:d>
+            <m:dPr>
+              <m:ctrlPr>
+                <w:rPr>
+                  <w:rFonts w:ascii="Cambria Math" w:hAnsi="Cambria Math"/>
+                  <w:i/>
+                </w:rPr>
+              </m:ctrlPr>
+            </m:dPr>
+            <m:e>
+              <m:sSub>
+                <m:sSubPr>
+                  <m:ctrlPr>
+                    <w:rPr>
+                      <w:rFonts w:ascii="Cambria Math" w:hAnsi="Cambria Math"/>
+                      <w:i/>
+                    </w:rPr>
+                  </m:ctrlPr>
+                </m:sSubPr>
+                <m:e>
+                  <m:r>
+                    <w:rPr>
+                      <w:rFonts w:ascii="Cambria Math" w:hAnsi="Cambria Math"/>
+                    </w:rPr>
+                    <m:t>t</m:t>
+                  </m:r>
+                </m:e>
+                <m:sub>
+                  <m:r>
+                    <w:rPr>
+                      <w:rFonts w:ascii="Cambria Math" w:hAnsi="Cambria Math"/>
+                    </w:rPr>
+                    <m:t>1</m:t>
+                  </m:r>
+                </m:sub>
+              </m:sSub>
+              <m:r>
+                <w:rPr>
+                  <w:rFonts w:ascii="Cambria Math" w:hAnsi="Cambria Math"/>
+                </w:rPr>
+                <m:t>-</m:t>
+              </m:r>
+              <m:sSub>
+                <m:sSubPr>
+                  <m:ctrlPr>
+                    <w:rPr>
+                      <w:rFonts w:ascii="Cambria Math" w:hAnsi="Cambria Math"/>
+                      <w:i/>
+                    </w:rPr>
+                  </m:ctrlPr>
+                </m:sSubPr>
+                <m:e>
+                  <m:r>
+                    <w:rPr>
+                      <w:rFonts w:ascii="Cambria Math" w:hAnsi="Cambria Math"/>
+                    </w:rPr>
+                    <m:t>t</m:t>
+                  </m:r>
+                </m:e>
+                <m:sub>
+                  <m:r>
+                    <w:rPr>
+                      <w:rFonts w:ascii="Cambria Math" w:hAnsi="Cambria Math"/>
+                    </w:rPr>
+                    <m:t>2</m:t>
+                  </m:r>
+                </m:sub>
+              </m:sSub>
+            </m:e>
+          </m:d>
+          <m:sSub>
+            <m:sSubPr>
+              <m:ctrlPr>
+                <w:rPr>
+                  <w:rFonts w:ascii="Cambria Math" w:hAnsi="Cambria Math"/>
+                  <w:i/>
+                </w:rPr>
+              </m:ctrlPr>
+            </m:sSubPr>
+            <m:e>
+              <m:r>
+                <w:rPr>
+                  <w:rFonts w:ascii="Cambria Math" w:hAnsi="Cambria Math"/>
+                </w:rPr>
+                <m:t>α</m:t>
+              </m:r>
+            </m:e>
+            <m:sub>
+              <m:r>
+                <w:rPr>
+                  <w:rFonts w:ascii="Cambria Math" w:hAnsi="Cambria Math"/>
+                </w:rPr>
+                <m:t>R</m:t>
+              </m:r>
+            </m:sub>
+          </m:sSub>
+          <m:r>
+            <w:rPr>
+              <w:rFonts w:ascii="Cambria Math" w:hAnsi="Cambria Math"/>
+            </w:rPr>
+            <m:t>f</m:t>
+          </m:r>
+        </m:oMath>
+      </m:oMathPara>
+    </w:p>
+    <w:p>
+      <w:pPr>
+        <w:pStyle w:val="Lenda"/>
+        <w:jc w:val="right"/>
+        <w:rPr>
+          <w:i w:val="0"/>
+        </w:rPr>
+      </w:pPr>
+      <w:r>
+        <w:t xml:space="preserve">Ecuación </w:t>
+      </w:r>
+      <w:fldSimple w:instr=" SEQ Ecuación \* ARABIC ">
+        <w:r>
+          <w:rPr>
+            <w:noProof/>
+          </w:rPr>
+          <w:t>2</w:t>
+        </w:r>
+      </w:fldSimple>
     </w:p>
     <w:p>
       <w:pPr>
         <w:pStyle w:val="Textodocorpo"/>
       </w:pPr>
+    </w:p>
+    <w:p>
+      <w:pPr>
+        <w:pStyle w:val="Textodocorpo"/>
+      </w:pPr>
+    </w:p>
+    <w:p>
+      <w:pPr>
+        <w:pStyle w:val="Textodocorpo"/>
+      </w:pPr>
       <w:r>
         <w:br w:type="page"/>
       </w:r>
@@ -1450,60 +1998,22 @@
       <w:pPr>
         <w:pStyle w:val="Ttulo2"/>
       </w:pPr>
-      <w:bookmarkStart w:id="8" w:name="_Toc217920024"/>
+      <w:bookmarkStart w:id="5" w:name="_Toc217920024"/>
       <w:r>
         <w:lastRenderedPageBreak/>
         <w:t>Obxectivos</w:t>
       </w:r>
-      <w:bookmarkEnd w:id="8"/>
+      <w:bookmarkEnd w:id="5"/>
     </w:p>
     <w:p>
       <w:pPr>
         <w:pStyle w:val="Textodocorpo"/>
-        <w:rPr>
-          <w:strike/>
-        </w:rPr>
-      </w:pPr>
-      <w:r>
-        <w:rPr>
-          <w:strike/>
-        </w:rPr>
-        <w:t>O obxectivo primeiro do proxecto é o deseño e construción dun prototipo co fin do estudo do consumo enerxético dunha vivenda.</w:t>
-      </w:r>
-    </w:p>
-    <w:p>
-      <w:pPr>
-        <w:pStyle w:val="Textodocorpo"/>
-        <w:rPr>
-          <w:strike/>
-        </w:rPr>
-      </w:pPr>
-    </w:p>
-    <w:p>
-      <w:pPr>
-        <w:pStyle w:val="Textodocorpo"/>
-        <w:rPr>
-          <w:strike/>
-        </w:rPr>
-      </w:pPr>
-      <w:r>
-        <w:rPr>
-          <w:strike/>
-        </w:rPr>
+      </w:pPr>
+      <w:r>
         <w:t xml:space="preserve">O obxectivo primeiro do proxecto é o deseño e construción dun prototipo que simule as condicións dunha vivenda </w:t>
       </w:r>
-    </w:p>
-    <w:p>
-      <w:pPr>
-        <w:pStyle w:val="Textodocorpo"/>
-      </w:pPr>
-    </w:p>
-    <w:p>
-      <w:pPr>
-        <w:pStyle w:val="Textodocorpo"/>
-      </w:pPr>
-      <w:r>
-        <w:t>O obxectivo primeiro do proxecto é achar un xeito de reducir o consumo enerxético dunha vivenda mellorar a eficiencia enerxética do fogar.</w:t>
+      <w:r>
+        <w:t>co fin de poder ser empregada para o estudo do illamento térmico que proporcionan distintos materiais.</w:t>
       </w:r>
     </w:p>
     <w:p>
@@ -1523,7 +2033,19 @@
         </w:numPr>
       </w:pPr>
       <w:r>
-        <w:t>Deseño dunha maqueta para realizar as probas pertinentes e construción da mesma.</w:t>
+        <w:t xml:space="preserve">Deseño </w:t>
+      </w:r>
+      <w:r>
+        <w:t>da</w:t>
+      </w:r>
+      <w:r>
+        <w:t xml:space="preserve"> maqueta</w:t>
+      </w:r>
+      <w:r>
+        <w:t xml:space="preserve">, que imite as características dunha vivenda, e </w:t>
+      </w:r>
+      <w:r>
+        <w:t>construción da mesma.</w:t>
       </w:r>
     </w:p>
     <w:p>
@@ -1546,8 +2068,19 @@
           <w:numId w:val="2"/>
         </w:numPr>
       </w:pPr>
-      <w:r>
-        <w:t>Instalación do sistema informático na maqueta e posta en funcionamento do prototipo.</w:t>
+      <w:proofErr w:type="spellStart"/>
+      <w:r>
+        <w:t>Implementación</w:t>
+      </w:r>
+      <w:proofErr w:type="spellEnd"/>
+      <w:r>
+        <w:t xml:space="preserve"> do sistema electrónico </w:t>
+      </w:r>
+      <w:r>
+        <w:t>na maqueta e posta en funcionamento do prototipo.</w:t>
+      </w:r>
+      <w:r>
+        <w:tab/>
       </w:r>
     </w:p>
     <w:p>
@@ -1559,9 +2092,6 @@
         </w:numPr>
       </w:pPr>
       <w:r>
-        <w:t>Toma e almacenamento de datos durante a fase experimental para acadar as conclusións do proxecto.</w:t>
-      </w:r>
-      <w:r>
         <w:br w:type="page"/>
       </w:r>
     </w:p>
@@ -1569,12 +2099,12 @@
       <w:pPr>
         <w:pStyle w:val="Ttulo2"/>
       </w:pPr>
-      <w:bookmarkStart w:id="9" w:name="_Toc217920025"/>
+      <w:bookmarkStart w:id="6" w:name="_Toc217920025"/>
       <w:r>
         <w:lastRenderedPageBreak/>
         <w:t>Material e método</w:t>
       </w:r>
-      <w:bookmarkEnd w:id="9"/>
+      <w:bookmarkEnd w:id="6"/>
     </w:p>
     <w:p>
       <w:pPr>
@@ -1610,16 +2140,11 @@
         <w:pStyle w:val="Textodocorpo"/>
       </w:pPr>
       <w:r>
-        <w:t xml:space="preserve">Tamén </w:t>
-      </w:r>
-      <w:proofErr w:type="spellStart"/>
-      <w:r>
-        <w:t>barallamo</w:t>
-      </w:r>
-      <w:r>
-        <w:t>-la</w:t>
-      </w:r>
-      <w:proofErr w:type="spellEnd"/>
+        <w:t>Tamén barallamo</w:t>
+      </w:r>
+      <w:r>
+        <w:t>s a</w:t>
+      </w:r>
       <w:r>
         <w:t xml:space="preserve"> idea de empregar un sistema de persiana para simular de forma máis exacta o efecto que causan estas na cantidade de luz no interior</w:t>
       </w:r>
@@ -1682,7 +2207,21 @@
         <w:pStyle w:val="Textodocorpo"/>
       </w:pPr>
       <w:r>
-        <w:t>Así mesmo, cada fachada está composta por pezas de [[nome técnico da madeira]] que deseñamos mediante o programa informático</w:t>
+        <w:t>Así mesmo, cada fachada está composta por pezas de</w:t>
+      </w:r>
+      <w:r>
+        <w:t xml:space="preserve"> </w:t>
+      </w:r>
+      <w:proofErr w:type="spellStart"/>
+      <w:r>
+        <w:t>contrachapado</w:t>
+      </w:r>
+      <w:proofErr w:type="spellEnd"/>
+      <w:r>
+        <w:t xml:space="preserve"> </w:t>
+      </w:r>
+      <w:r>
+        <w:t>que deseñamos mediante o programa informático</w:t>
       </w:r>
       <w:r>
         <w:t xml:space="preserve"> de deseño</w:t>
@@ -1704,26 +2243,23 @@
         <w:t xml:space="preserve"> ou “dedos”</w:t>
       </w:r>
       <w:r>
-        <w:t xml:space="preserve"> nos laterais destas para que encaixen nas pezas contiguas. Unha vez rematada a fase de deseño </w:t>
+        <w:t xml:space="preserve"> nos laterais destas para que encaixen nas pezas contiguas. Unha vez rematada a fase de deseño continuamo</w:t>
+      </w:r>
+      <w:r>
+        <w:t>s co</w:t>
+      </w:r>
+      <w:r>
+        <w:t xml:space="preserve"> proceso de construción empregando unha cortadora láser para cortar táboas de</w:t>
+      </w:r>
+      <w:r>
+        <w:t xml:space="preserve"> </w:t>
       </w:r>
       <w:proofErr w:type="spellStart"/>
       <w:r>
-        <w:t>continuamo</w:t>
-      </w:r>
-      <w:r>
-        <w:t>-lo</w:t>
+        <w:t>contrachapado</w:t>
       </w:r>
       <w:proofErr w:type="spellEnd"/>
       <w:r>
-        <w:t xml:space="preserve"> proceso de construción empregando unha cortadora láser para cortar táboas de </w:t>
-      </w:r>
-      <w:r>
-        <w:rPr>
-          <w:color w:val="EE0000"/>
-        </w:rPr>
-        <w:t>[[nome da madeira]]</w:t>
-      </w:r>
-      <w:r>
         <w:t xml:space="preserve">. </w:t>
       </w:r>
       <w:r>
@@ -1741,6 +2277,16 @@
     </w:p>
     <w:p>
       <w:pPr>
+        <w:pStyle w:val="Textodocorpo"/>
+      </w:pPr>
+    </w:p>
+    <w:p>
+      <w:pPr>
+        <w:pStyle w:val="Textodocorpo"/>
+      </w:pPr>
+    </w:p>
+    <w:p>
+      <w:pPr>
         <w:jc w:val="left"/>
       </w:pPr>
       <w:r>
@@ -1751,12 +2297,12 @@
       <w:pPr>
         <w:pStyle w:val="Ttulo2"/>
       </w:pPr>
-      <w:bookmarkStart w:id="10" w:name="_Toc217920026"/>
+      <w:bookmarkStart w:id="7" w:name="_Toc217920026"/>
       <w:r>
         <w:lastRenderedPageBreak/>
         <w:t>Resultados</w:t>
       </w:r>
-      <w:bookmarkEnd w:id="10"/>
+      <w:bookmarkEnd w:id="7"/>
       <w:r>
         <w:br w:type="page"/>
       </w:r>
@@ -1765,12 +2311,12 @@
       <w:pPr>
         <w:pStyle w:val="Ttulo2"/>
       </w:pPr>
-      <w:bookmarkStart w:id="11" w:name="_Toc217920027"/>
+      <w:bookmarkStart w:id="8" w:name="_Toc217920027"/>
       <w:r>
         <w:lastRenderedPageBreak/>
         <w:t>Discusión</w:t>
       </w:r>
-      <w:bookmarkEnd w:id="11"/>
+      <w:bookmarkEnd w:id="8"/>
       <w:r>
         <w:br w:type="page"/>
       </w:r>
@@ -1779,12 +2325,12 @@
       <w:pPr>
         <w:pStyle w:val="Ttulo2"/>
       </w:pPr>
-      <w:bookmarkStart w:id="12" w:name="_Toc217920028"/>
+      <w:bookmarkStart w:id="9" w:name="_Toc217920028"/>
       <w:r>
         <w:lastRenderedPageBreak/>
         <w:t>Conclusións</w:t>
       </w:r>
-      <w:bookmarkEnd w:id="12"/>
+      <w:bookmarkEnd w:id="9"/>
     </w:p>
     <w:p>
       <w:pPr>
@@ -1794,45 +2340,42 @@
         <w:br w:type="page"/>
       </w:r>
     </w:p>
-    <w:bookmarkStart w:id="13" w:name="_Toc217920029" w:displacedByCustomXml="next"/>
     <w:sdt>
       <w:sdtPr>
+        <w:id w:val="-350486351"/>
+        <w:docPartObj>
+          <w:docPartGallery w:val="Bibliographies"/>
+          <w:docPartUnique/>
+        </w:docPartObj>
+      </w:sdtPr>
+      <w:sdtEndPr>
         <w:rPr>
           <w:rFonts w:ascii="Arial" w:eastAsia="NSimSun" w:hAnsi="Arial"/>
           <w:bCs w:val="0"/>
           <w:sz w:val="24"/>
           <w:szCs w:val="24"/>
         </w:rPr>
-        <w:id w:val="1152650566"/>
-        <w:docPartObj>
-          <w:docPartGallery w:val="Bibliographies"/>
-          <w:docPartUnique/>
-        </w:docPartObj>
-      </w:sdtPr>
+      </w:sdtEndPr>
       <w:sdtContent>
         <w:p>
           <w:pPr>
             <w:pStyle w:val="Ttulo2"/>
-            <w:numPr>
-              <w:ilvl w:val="0"/>
-              <w:numId w:val="0"/>
-            </w:numPr>
-            <w:jc w:val="center"/>
           </w:pPr>
           <w:r>
             <w:t>Bibliografía</w:t>
           </w:r>
-          <w:bookmarkEnd w:id="13"/>
         </w:p>
         <w:sdt>
           <w:sdtPr>
+            <w:id w:val="111145805"/>
+            <w:bibliography/>
+          </w:sdtPr>
+          <w:sdtEndPr>
             <w:rPr>
               <w:rFonts w:cs="Lucida Sans"/>
               <w:szCs w:val="24"/>
             </w:rPr>
-            <w:id w:val="111145805"/>
-            <w:bibliography/>
-          </w:sdtPr>
+          </w:sdtEndPr>
           <w:sdtContent>
             <w:p>
               <w:pPr>
@@ -1871,7 +2414,36 @@
                 <w:rPr>
                   <w:noProof/>
                 </w:rPr>
-                <w:t xml:space="preserve"> Obtenido de https://www.idae.es/sites/default/files/estudios_informes_y_estadisticas/Informe_SPAHOUSEC_Basico_logo_Eurostat_negro_FINAL.pdf</w:t>
+                <w:t xml:space="preserve"> Obtido de https://www.idae.es/sites/default/files/estudios_informes_y_estadisticas/Informe_SPAHOUSEC_Basico_logo_Eurostat_negro_FINAL.pdf</w:t>
+              </w:r>
+            </w:p>
+            <w:p>
+              <w:pPr>
+                <w:pStyle w:val="Bibliografa"/>
+                <w:ind w:left="720" w:hanging="720"/>
+                <w:rPr>
+                  <w:noProof/>
+                </w:rPr>
+              </w:pPr>
+              <w:r>
+                <w:rPr>
+                  <w:noProof/>
+                </w:rPr>
+                <w:t xml:space="preserve">INEGA. (Maio de 2025). </w:t>
+              </w:r>
+              <w:r>
+                <w:rPr>
+                  <w:i/>
+                  <w:iCs/>
+                  <w:noProof/>
+                </w:rPr>
+                <w:t>Balance Enerxético de Galicia 2023.</w:t>
+              </w:r>
+              <w:r>
+                <w:rPr>
+                  <w:noProof/>
+                </w:rPr>
+                <w:t xml:space="preserve"> Obtido de https://www.inega.gal/sites/default/files/publicacions/Balance_enerxetico_Galicia_2023_maio_2025.pdf</w:t>
               </w:r>
             </w:p>
             <w:p>
@@ -1916,6 +2488,96 @@
         </w:sdt>
       </w:sdtContent>
     </w:sdt>
+    <w:p>
+      <w:pPr>
+        <w:pStyle w:val="Ttulo2"/>
+      </w:pPr>
+      <w:r>
+        <w:t>Ecuacións</w:t>
+      </w:r>
+    </w:p>
+    <w:p>
+      <w:pPr>
+        <w:pStyle w:val="Tboadeilustracins"/>
+        <w:tabs>
+          <w:tab w:val="right" w:leader="dot" w:pos="9628"/>
+        </w:tabs>
+        <w:rPr>
+          <w:noProof/>
+        </w:rPr>
+      </w:pPr>
+      <w:r>
+        <w:fldChar w:fldCharType="begin"/>
+      </w:r>
+      <w:r>
+        <w:instrText xml:space="preserve"> TOC \h \z \c "Ecuación" </w:instrText>
+      </w:r>
+      <w:r>
+        <w:fldChar w:fldCharType="separate"/>
+      </w:r>
+      <w:hyperlink w:anchor="_Toc220770995" w:history="1">
+        <w:r>
+          <w:rPr>
+            <w:rStyle w:val="Hiperligazn"/>
+            <w:noProof/>
+          </w:rPr>
+          <w:t>Ecuación 1</w:t>
+        </w:r>
+        <w:r>
+          <w:rPr>
+            <w:noProof/>
+            <w:webHidden/>
+          </w:rPr>
+          <w:tab/>
+        </w:r>
+        <w:r>
+          <w:rPr>
+            <w:noProof/>
+            <w:webHidden/>
+          </w:rPr>
+          <w:fldChar w:fldCharType="begin"/>
+        </w:r>
+        <w:r>
+          <w:rPr>
+            <w:noProof/>
+            <w:webHidden/>
+          </w:rPr>
+          <w:instrText xml:space="preserve"> PAGEREF _Toc220770995 \h </w:instrText>
+        </w:r>
+        <w:r>
+          <w:rPr>
+            <w:noProof/>
+            <w:webHidden/>
+          </w:rPr>
+        </w:r>
+        <w:r>
+          <w:rPr>
+            <w:noProof/>
+            <w:webHidden/>
+          </w:rPr>
+          <w:fldChar w:fldCharType="separate"/>
+        </w:r>
+        <w:r>
+          <w:rPr>
+            <w:noProof/>
+            <w:webHidden/>
+          </w:rPr>
+          <w:t>5</w:t>
+        </w:r>
+        <w:r>
+          <w:rPr>
+            <w:noProof/>
+            <w:webHidden/>
+          </w:rPr>
+          <w:fldChar w:fldCharType="end"/>
+        </w:r>
+      </w:hyperlink>
+    </w:p>
+    <w:p>
+      <w:r>
+        <w:fldChar w:fldCharType="end"/>
+      </w:r>
+    </w:p>
     <w:sectPr>
       <w:footerReference w:type="default" r:id="rId8"/>
       <w:pgSz w:w="11906" w:h="16838"/>
@@ -2003,6 +2665,43 @@
       <w:rPr>
         <w:rFonts w:ascii="Redzone" w:hAnsi="Redzone"/>
       </w:rPr>
+      <w:t>/</w:t>
+    </w:r>
+    <w:r>
+      <w:rPr>
+        <w:rFonts w:ascii="Redzone" w:hAnsi="Redzone"/>
+      </w:rPr>
+      <w:fldChar w:fldCharType="begin"/>
+    </w:r>
+    <w:r>
+      <w:rPr>
+        <w:rFonts w:ascii="Redzone" w:hAnsi="Redzone"/>
+      </w:rPr>
+      <w:instrText xml:space="preserve"> NUMPAGES   \* MERGEFORMAT </w:instrText>
+    </w:r>
+    <w:r>
+      <w:rPr>
+        <w:rFonts w:ascii="Redzone" w:hAnsi="Redzone"/>
+      </w:rPr>
+      <w:fldChar w:fldCharType="separate"/>
+    </w:r>
+    <w:r>
+      <w:rPr>
+        <w:rFonts w:ascii="Redzone" w:hAnsi="Redzone"/>
+        <w:noProof/>
+      </w:rPr>
+      <w:t>12</w:t>
+    </w:r>
+    <w:r>
+      <w:rPr>
+        <w:rFonts w:ascii="Redzone" w:hAnsi="Redzone"/>
+      </w:rPr>
+      <w:fldChar w:fldCharType="end"/>
+    </w:r>
+    <w:r>
+      <w:rPr>
+        <w:rFonts w:ascii="Redzone" w:hAnsi="Redzone"/>
+      </w:rPr>
       <w:tab/>
       <w:t>Saúl Cid Seijas</w:t>
     </w:r>
@@ -2023,6 +2722,28 @@
     <w:p>
       <w:r>
         <w:continuationSeparator/>
+      </w:r>
+    </w:p>
+  </w:footnote>
+  <w:footnote w:id="1">
+    <w:p>
+      <w:pPr>
+        <w:pStyle w:val="Textodenotaaopdepxina"/>
+      </w:pPr>
+      <w:r>
+        <w:rPr>
+          <w:rStyle w:val="Referenciadenotaaopdepxina"/>
+        </w:rPr>
+        <w:footnoteRef/>
+      </w:r>
+      <w:r>
+        <w:t xml:space="preserve"> </w:t>
+      </w:r>
+      <w:r>
+        <w:t>Milleiros</w:t>
+      </w:r>
+      <w:r>
+        <w:t xml:space="preserve"> de toneladas equivalentes de petróleo. 1ktep = 10MWh</w:t>
       </w:r>
     </w:p>
   </w:footnote>
@@ -3314,14 +4035,6 @@
     <w:abstractNumId w:val="7"/>
   </w:num>
 </w:numbering>
-</file>
-
-<file path=word/people.xml><?xml version="1.0" encoding="utf-8"?>
-<w15:people xmlns:wpc="http://schemas.microsoft.com/office/word/2010/wordprocessingCanvas" xmlns:cx="http://schemas.microsoft.com/office/drawing/2014/chartex" xmlns:cx1="http://schemas.microsoft.com/office/drawing/2015/9/8/chartex" xmlns:cx2="http://schemas.microsoft.com/office/drawing/2015/10/21/chartex" xmlns:cx3="http://schemas.microsoft.com/office/drawing/2016/5/9/chartex" xmlns:cx4="http://schemas.microsoft.com/office/drawing/2016/5/10/chartex" xmlns:cx5="http://schemas.microsoft.com/office/drawing/2016/5/11/chartex" xmlns:cx6="http://schemas.microsoft.com/office/drawing/2016/5/12/chartex" xmlns:cx7="http://schemas.microsoft.com/office/drawing/2016/5/13/chartex" xmlns:cx8="http://schemas.microsoft.com/office/drawing/2016/5/14/chartex" xmlns:mc="http://schemas.openxmlformats.org/markup-compatibility/2006" xmlns:aink="http://schemas.microsoft.com/office/drawing/2016/ink" xmlns:am3d="http://schemas.microsoft.com/office/drawing/2017/model3d" xmlns:o="urn:schemas-microsoft-com:office:office" xmlns:oel="http://schemas.microsoft.com/office/2019/extlst" xmlns:r="http://schemas.openxmlformats.org/officeDocument/2006/relationships" xmlns:m="http://schemas.openxmlformats.org/officeDocument/2006/math" xmlns:v="urn:schemas-microsoft-com:vml" xmlns:wp14="http://schemas.microsoft.com/office/word/2010/wordprocessingDrawing" xmlns:wp="http://schemas.openxmlformats.org/drawingml/2006/wordprocessingDrawing" xmlns:w10="urn:schemas-microsoft-com:office:word" xmlns:w="http://schemas.openxmlformats.org/wordprocessingml/2006/main" xmlns:w14="http://schemas.microsoft.com/office/word/2010/wordml" xmlns:w15="http://schemas.microsoft.com/office/word/2012/wordml" xmlns:w16cex="http://schemas.microsoft.com/office/word/2018/wordml/cex" xmlns:w16cid="http://schemas.microsoft.com/office/word/2016/wordml/cid" xmlns:w16="http://schemas.microsoft.com/office/word/2018/wordml" xmlns:w16du="http://schemas.microsoft.com/office/word/2023/wordml/word16du" xmlns:w16sdtdh="http://schemas.microsoft.com/office/word/2020/wordml/sdtdatahash" xmlns:w16sdtfl="http://schemas.microsoft.com/office/word/2024/wordml/sdtformatlock" xmlns:w16se="http://schemas.microsoft.com/office/word/2015/wordml/symex" xmlns:wpg="http://schemas.microsoft.com/office/word/2010/wordprocessingGroup" xmlns:wpi="http://schemas.microsoft.com/office/word/2010/wordprocessingInk" xmlns:wne="http://schemas.microsoft.com/office/word/2006/wordml" xmlns:wps="http://schemas.microsoft.com/office/word/2010/wordprocessingShape" mc:Ignorable="w14 w15 w16se w16cid w16 w16cex w16sdtdh w16sdtfl w16du wp14">
-  <w15:person w15:author="Saúl Cid">
-    <w15:presenceInfo w15:providerId="Windows Live" w15:userId="994e6406a2f9ce29"/>
-  </w15:person>
-</w15:people>
 </file>
 
 <file path=word/styles.xml><?xml version="1.0" encoding="utf-8"?>
@@ -4331,6 +5044,56 @@
       </w:numPr>
     </w:pPr>
   </w:style>
+  <w:style w:type="paragraph" w:styleId="Textodenotadefin">
+    <w:name w:val="endnote text"/>
+    <w:basedOn w:val="Normal"/>
+    <w:link w:val="TextodenotadefinCarc"/>
+    <w:uiPriority w:val="99"/>
+    <w:semiHidden/>
+    <w:unhideWhenUsed/>
+    <w:rsid w:val="00C73D9B"/>
+    <w:rPr>
+      <w:rFonts w:cs="Mangal"/>
+      <w:sz w:val="20"/>
+      <w:szCs w:val="18"/>
+    </w:rPr>
+  </w:style>
+  <w:style w:type="character" w:customStyle="1" w:styleId="TextodenotadefinCarc">
+    <w:name w:val="Texto de nota de fin Carác."/>
+    <w:basedOn w:val="Tipodeletrapredefinidodopargrafo"/>
+    <w:link w:val="Textodenotadefin"/>
+    <w:uiPriority w:val="99"/>
+    <w:semiHidden/>
+    <w:rsid w:val="00C73D9B"/>
+    <w:rPr>
+      <w:rFonts w:ascii="Arial" w:hAnsi="Arial" w:cs="Mangal"/>
+      <w:sz w:val="20"/>
+      <w:szCs w:val="18"/>
+    </w:rPr>
+  </w:style>
+  <w:style w:type="character" w:styleId="Referenciadenotadefin">
+    <w:name w:val="endnote reference"/>
+    <w:basedOn w:val="Tipodeletrapredefinidodopargrafo"/>
+    <w:uiPriority w:val="99"/>
+    <w:semiHidden/>
+    <w:unhideWhenUsed/>
+    <w:rsid w:val="00C73D9B"/>
+    <w:rPr>
+      <w:vertAlign w:val="superscript"/>
+    </w:rPr>
+  </w:style>
+  <w:style w:type="paragraph" w:styleId="Tboadeilustracins">
+    <w:name w:val="table of figures"/>
+    <w:basedOn w:val="Normal"/>
+    <w:next w:val="Normal"/>
+    <w:uiPriority w:val="99"/>
+    <w:unhideWhenUsed/>
+    <w:rsid w:val="001D33E6"/>
+    <w:rPr>
+      <w:rFonts w:cs="Mangal"/>
+      <w:szCs w:val="21"/>
+    </w:rPr>
+  </w:style>
 </w:styles>
 </file>
 
@@ -4445,9 +5208,29 @@
 <file path=customXml/item1.xml><?xml version="1.0" encoding="utf-8"?>
 <b:Sources xmlns:b="http://schemas.openxmlformats.org/officeDocument/2006/bibliography" xmlns="http://schemas.openxmlformats.org/officeDocument/2006/bibliography" SelectedStyle="\APASixthEditionOfficeOnline.xsl" StyleName="APA" Version="6">
   <b:Source>
+    <b:Tag>INE25</b:Tag>
+    <b:SourceType>DocumentFromInternetSite</b:SourceType>
+    <b:Guid>{2D2EBBBE-4904-439C-B030-08C784B10168}</b:Guid>
+    <b:LCID>gl-ES</b:LCID>
+    <b:Author>
+      <b:Author>
+        <b:NameList>
+          <b:Person>
+            <b:Last>INEGA</b:Last>
+          </b:Person>
+        </b:NameList>
+      </b:Author>
+    </b:Author>
+    <b:Title>Balance Enerxético de Galicia 2023</b:Title>
+    <b:Year>2025</b:Year>
+    <b:Month>Maio</b:Month>
+    <b:URL>https://www.inega.gal/sites/default/files/publicacions/Balance_enerxetico_Galicia_2023_maio_2025.pdf</b:URL>
+    <b:RefOrder>1</b:RefOrder>
+  </b:Source>
+  <b:Source>
     <b:Tag>Man83</b:Tag>
     <b:SourceType>Book</b:SourceType>
-    <b:Guid>{C6FB1E97-1F66-4D30-9AA4-88A479B2F2B9}</b:Guid>
+    <b:Guid>{67238F73-17CB-41EC-B922-AEE187B2F324}</b:Guid>
     <b:Title>Aislamiento térmico</b:Title>
     <b:Year>1983</b:Year>
     <b:Author>
@@ -4461,28 +5244,49 @@
       </b:Author>
     </b:Author>
     <b:Publisher>Reverte</b:Publisher>
-    <b:RefOrder>2</b:RefOrder>
+    <b:LCID>gl-ES</b:LCID>
+    <b:RefOrder>4</b:RefOrder>
   </b:Source>
   <b:Source>
     <b:Tag>Ins10</b:Tag>
     <b:SourceType>Report</b:SourceType>
-    <b:Guid>{527455EA-B932-471C-A505-781C54F13EBF}</b:Guid>
+    <b:Guid>{07E4DB0C-F317-43F9-984A-8F369AFA6393}</b:Guid>
     <b:Title>Consumos del Sector Residencial en España (Proyecto SPAHOUSEC)</b:Title>
     <b:Year>2010</b:Year>
-    <b:LCID>es-ES</b:LCID>
+    <b:LCID>gl-ES</b:LCID>
     <b:Author>
       <b:Author>
         <b:Corporate>IDAE</b:Corporate>
       </b:Author>
     </b:Author>
     <b:URL>https://www.idae.es/sites/default/files/estudios_informes_y_estadisticas/Informe_SPAHOUSEC_Basico_logo_Eurostat_negro_FINAL.pdf</b:URL>
-    <b:RefOrder>1</b:RefOrder>
+    <b:RefOrder>3</b:RefOrder>
+  </b:Source>
+  <b:Source>
+    <b:Tag>Zam15</b:Tag>
+    <b:SourceType>DocumentFromInternetSite</b:SourceType>
+    <b:Guid>{4EA112B6-644B-4D8E-905B-079B29062749}</b:Guid>
+    <b:Author>
+      <b:Author>
+        <b:NameList>
+          <b:Person>
+            <b:Last>Zamora Martínez</b:Last>
+            <b:First>Marisela</b:First>
+            <b:Middle>Cristina</b:Middle>
+          </b:Person>
+        </b:NameList>
+      </b:Author>
+    </b:Author>
+    <b:Title>Cambio climático. Revista mexicana de ciencias forestales</b:Title>
+    <b:Year>2015</b:Year>
+    <b:URL>http://www.scielo.org.mx/scielo.php?script=sci_arttext&amp;pid=S2007-11322015000500001&amp;lng=es&amp;tlng=es</b:URL>
+    <b:RefOrder>2</b:RefOrder>
   </b:Source>
 </b:Sources>
 </file>
 
 <file path=customXml/itemProps1.xml><?xml version="1.0" encoding="utf-8"?>
-<ds:datastoreItem xmlns:ds="http://schemas.openxmlformats.org/officeDocument/2006/customXml" ds:itemID="{1D341098-942E-4ED0-BFFF-932D77C50A4C}">
+<ds:datastoreItem xmlns:ds="http://schemas.openxmlformats.org/officeDocument/2006/customXml" ds:itemID="{37350A32-C427-4772-900E-A9BCAE5951B2}">
   <ds:schemaRefs>
     <ds:schemaRef ds:uri="http://schemas.openxmlformats.org/officeDocument/2006/bibliography"/>
   </ds:schemaRefs>

</xml_diff>

<commit_message>
Engadidos programas arduinos para os sensores
</commit_message>
<xml_diff>
--- a/Proxecto.docx
+++ b/Proxecto.docx
@@ -5,14 +5,22 @@
     <w:p>
       <w:pPr>
         <w:pStyle w:val="Ttulo1"/>
+        <w:numPr>
+          <w:ilvl w:val="0"/>
+          <w:numId w:val="0"/>
+        </w:numPr>
       </w:pPr>
       <w:bookmarkStart w:id="0" w:name="_Toc217919842"/>
       <w:bookmarkStart w:id="1" w:name="_Toc217920021"/>
+      <w:bookmarkStart w:id="2" w:name="_Toc220773847"/>
+      <w:bookmarkStart w:id="3" w:name="_Toc221299568"/>
       <w:r>
         <w:t>Deseño e construción dun prototipo para o estudo do consumo enerxético en vivendas</w:t>
       </w:r>
       <w:bookmarkEnd w:id="0"/>
       <w:bookmarkEnd w:id="1"/>
+      <w:bookmarkEnd w:id="2"/>
+      <w:bookmarkEnd w:id="3"/>
       <w:r>
         <w:br w:type="page"/>
       </w:r>
@@ -38,11 +46,9 @@
       <w:pPr>
         <w:jc w:val="left"/>
       </w:pPr>
-      <w:proofErr w:type="spellStart"/>
       <w:r>
         <w:t>Abstract</w:t>
       </w:r>
-      <w:proofErr w:type="spellEnd"/>
     </w:p>
     <w:p>
       <w:pPr>
@@ -54,19 +60,9 @@
           <w:szCs w:val="36"/>
         </w:rPr>
       </w:pPr>
-      <w:proofErr w:type="spellStart"/>
-      <w:r>
-        <w:t>Key</w:t>
-      </w:r>
-      <w:proofErr w:type="spellEnd"/>
-      <w:r>
-        <w:t xml:space="preserve"> </w:t>
-      </w:r>
-      <w:proofErr w:type="spellStart"/>
-      <w:r>
-        <w:t>Words</w:t>
-      </w:r>
-      <w:proofErr w:type="spellEnd"/>
+      <w:r>
+        <w:t>Key Words</w:t>
+      </w:r>
       <w:r>
         <w:br w:type="page"/>
       </w:r>
@@ -100,7 +96,7 @@
           <w:tab w:val="right" w:leader="dot" w:pos="9628"/>
         </w:tabs>
         <w:rPr>
-          <w:rFonts w:eastAsiaTheme="minorEastAsia" w:cstheme="minorBidi"/>
+          <w:rFonts w:ascii="Redzone" w:eastAsiaTheme="minorEastAsia" w:hAnsi="Redzone" w:cstheme="minorBidi"/>
           <w:smallCaps w:val="0"/>
           <w:noProof/>
           <w:sz w:val="24"/>
@@ -109,10 +105,11 @@
           <w14:ligatures w14:val="standardContextual"/>
         </w:rPr>
       </w:pPr>
-      <w:hyperlink w:anchor="_Toc217920022" w:history="1">
+      <w:hyperlink w:anchor="_Toc221299569" w:history="1">
         <w:r>
           <w:rPr>
             <w:rStyle w:val="Hiperligazn"/>
+            <w:rFonts w:ascii="Redzone" w:hAnsi="Redzone"/>
             <w:noProof/>
             <w:sz w:val="24"/>
             <w:szCs w:val="24"/>
@@ -121,7 +118,7 @@
         </w:r>
         <w:r>
           <w:rPr>
-            <w:rFonts w:eastAsiaTheme="minorEastAsia" w:cstheme="minorBidi"/>
+            <w:rFonts w:ascii="Redzone" w:eastAsiaTheme="minorEastAsia" w:hAnsi="Redzone" w:cstheme="minorBidi"/>
             <w:smallCaps w:val="0"/>
             <w:noProof/>
             <w:sz w:val="24"/>
@@ -134,6 +131,7 @@
         <w:r>
           <w:rPr>
             <w:rStyle w:val="Hiperligazn"/>
+            <w:rFonts w:ascii="Redzone" w:hAnsi="Redzone"/>
             <w:noProof/>
             <w:sz w:val="24"/>
             <w:szCs w:val="24"/>
@@ -142,6 +140,7 @@
         </w:r>
         <w:r>
           <w:rPr>
+            <w:rFonts w:ascii="Redzone" w:hAnsi="Redzone"/>
             <w:noProof/>
             <w:webHidden/>
             <w:sz w:val="24"/>
@@ -151,6 +150,7 @@
         </w:r>
         <w:r>
           <w:rPr>
+            <w:rFonts w:ascii="Redzone" w:hAnsi="Redzone"/>
             <w:noProof/>
             <w:webHidden/>
             <w:sz w:val="24"/>
@@ -160,23 +160,26 @@
         </w:r>
         <w:r>
           <w:rPr>
-            <w:noProof/>
-            <w:webHidden/>
-            <w:sz w:val="24"/>
-            <w:szCs w:val="24"/>
-          </w:rPr>
-          <w:instrText xml:space="preserve"> PAGEREF _Toc217920022 \h </w:instrText>
-        </w:r>
-        <w:r>
-          <w:rPr>
-            <w:noProof/>
-            <w:webHidden/>
-            <w:sz w:val="24"/>
-            <w:szCs w:val="24"/>
-          </w:rPr>
-        </w:r>
-        <w:r>
-          <w:rPr>
+            <w:rFonts w:ascii="Redzone" w:hAnsi="Redzone"/>
+            <w:noProof/>
+            <w:webHidden/>
+            <w:sz w:val="24"/>
+            <w:szCs w:val="24"/>
+          </w:rPr>
+          <w:instrText xml:space="preserve"> PAGEREF _Toc221299569 \h </w:instrText>
+        </w:r>
+        <w:r>
+          <w:rPr>
+            <w:rFonts w:ascii="Redzone" w:hAnsi="Redzone"/>
+            <w:noProof/>
+            <w:webHidden/>
+            <w:sz w:val="24"/>
+            <w:szCs w:val="24"/>
+          </w:rPr>
+        </w:r>
+        <w:r>
+          <w:rPr>
+            <w:rFonts w:ascii="Redzone" w:hAnsi="Redzone"/>
             <w:noProof/>
             <w:webHidden/>
             <w:sz w:val="24"/>
@@ -186,15 +189,17 @@
         </w:r>
         <w:r>
           <w:rPr>
-            <w:noProof/>
-            <w:webHidden/>
-            <w:sz w:val="24"/>
-            <w:szCs w:val="24"/>
-          </w:rPr>
-          <w:t>3</w:t>
-        </w:r>
-        <w:r>
-          <w:rPr>
+            <w:rFonts w:ascii="Redzone" w:hAnsi="Redzone"/>
+            <w:noProof/>
+            <w:webHidden/>
+            <w:sz w:val="24"/>
+            <w:szCs w:val="24"/>
+          </w:rPr>
+          <w:t>4</w:t>
+        </w:r>
+        <w:r>
+          <w:rPr>
+            <w:rFonts w:ascii="Redzone" w:hAnsi="Redzone"/>
             <w:noProof/>
             <w:webHidden/>
             <w:sz w:val="24"/>
@@ -212,7 +217,7 @@
           <w:tab w:val="right" w:leader="dot" w:pos="9628"/>
         </w:tabs>
         <w:rPr>
-          <w:rFonts w:eastAsiaTheme="minorEastAsia" w:cstheme="minorBidi"/>
+          <w:rFonts w:ascii="Redzone" w:eastAsiaTheme="minorEastAsia" w:hAnsi="Redzone" w:cstheme="minorBidi"/>
           <w:smallCaps w:val="0"/>
           <w:noProof/>
           <w:sz w:val="24"/>
@@ -221,10 +226,11 @@
           <w14:ligatures w14:val="standardContextual"/>
         </w:rPr>
       </w:pPr>
-      <w:hyperlink w:anchor="_Toc217920023" w:history="1">
+      <w:hyperlink w:anchor="_Toc221299570" w:history="1">
         <w:r>
           <w:rPr>
             <w:rStyle w:val="Hiperligazn"/>
+            <w:rFonts w:ascii="Redzone" w:hAnsi="Redzone"/>
             <w:noProof/>
             <w:sz w:val="24"/>
             <w:szCs w:val="24"/>
@@ -233,7 +239,7 @@
         </w:r>
         <w:r>
           <w:rPr>
-            <w:rFonts w:eastAsiaTheme="minorEastAsia" w:cstheme="minorBidi"/>
+            <w:rFonts w:ascii="Redzone" w:eastAsiaTheme="minorEastAsia" w:hAnsi="Redzone" w:cstheme="minorBidi"/>
             <w:smallCaps w:val="0"/>
             <w:noProof/>
             <w:sz w:val="24"/>
@@ -246,6 +252,7 @@
         <w:r>
           <w:rPr>
             <w:rStyle w:val="Hiperligazn"/>
+            <w:rFonts w:ascii="Redzone" w:hAnsi="Redzone"/>
             <w:noProof/>
             <w:sz w:val="24"/>
             <w:szCs w:val="24"/>
@@ -254,6 +261,7 @@
         </w:r>
         <w:r>
           <w:rPr>
+            <w:rFonts w:ascii="Redzone" w:hAnsi="Redzone"/>
             <w:noProof/>
             <w:webHidden/>
             <w:sz w:val="24"/>
@@ -263,6 +271,7 @@
         </w:r>
         <w:r>
           <w:rPr>
+            <w:rFonts w:ascii="Redzone" w:hAnsi="Redzone"/>
             <w:noProof/>
             <w:webHidden/>
             <w:sz w:val="24"/>
@@ -272,23 +281,26 @@
         </w:r>
         <w:r>
           <w:rPr>
-            <w:noProof/>
-            <w:webHidden/>
-            <w:sz w:val="24"/>
-            <w:szCs w:val="24"/>
-          </w:rPr>
-          <w:instrText xml:space="preserve"> PAGEREF _Toc217920023 \h </w:instrText>
-        </w:r>
-        <w:r>
-          <w:rPr>
-            <w:noProof/>
-            <w:webHidden/>
-            <w:sz w:val="24"/>
-            <w:szCs w:val="24"/>
-          </w:rPr>
-        </w:r>
-        <w:r>
-          <w:rPr>
+            <w:rFonts w:ascii="Redzone" w:hAnsi="Redzone"/>
+            <w:noProof/>
+            <w:webHidden/>
+            <w:sz w:val="24"/>
+            <w:szCs w:val="24"/>
+          </w:rPr>
+          <w:instrText xml:space="preserve"> PAGEREF _Toc221299570 \h </w:instrText>
+        </w:r>
+        <w:r>
+          <w:rPr>
+            <w:rFonts w:ascii="Redzone" w:hAnsi="Redzone"/>
+            <w:noProof/>
+            <w:webHidden/>
+            <w:sz w:val="24"/>
+            <w:szCs w:val="24"/>
+          </w:rPr>
+        </w:r>
+        <w:r>
+          <w:rPr>
+            <w:rFonts w:ascii="Redzone" w:hAnsi="Redzone"/>
             <w:noProof/>
             <w:webHidden/>
             <w:sz w:val="24"/>
@@ -298,15 +310,263 @@
         </w:r>
         <w:r>
           <w:rPr>
-            <w:noProof/>
-            <w:webHidden/>
-            <w:sz w:val="24"/>
-            <w:szCs w:val="24"/>
-          </w:rPr>
-          <w:t>4</w:t>
-        </w:r>
-        <w:r>
-          <w:rPr>
+            <w:rFonts w:ascii="Redzone" w:hAnsi="Redzone"/>
+            <w:noProof/>
+            <w:webHidden/>
+            <w:sz w:val="24"/>
+            <w:szCs w:val="24"/>
+          </w:rPr>
+          <w:t>5</w:t>
+        </w:r>
+        <w:r>
+          <w:rPr>
+            <w:rFonts w:ascii="Redzone" w:hAnsi="Redzone"/>
+            <w:noProof/>
+            <w:webHidden/>
+            <w:sz w:val="24"/>
+            <w:szCs w:val="24"/>
+          </w:rPr>
+          <w:fldChar w:fldCharType="end"/>
+        </w:r>
+      </w:hyperlink>
+    </w:p>
+    <w:p>
+      <w:pPr>
+        <w:pStyle w:val="Tboadecontidos3"/>
+        <w:tabs>
+          <w:tab w:val="left" w:pos="960"/>
+          <w:tab w:val="right" w:leader="dot" w:pos="9628"/>
+        </w:tabs>
+        <w:rPr>
+          <w:rFonts w:ascii="Redzone" w:eastAsiaTheme="minorEastAsia" w:hAnsi="Redzone" w:cstheme="minorBidi"/>
+          <w:i w:val="0"/>
+          <w:iCs w:val="0"/>
+          <w:noProof/>
+          <w:sz w:val="24"/>
+          <w:szCs w:val="24"/>
+          <w:lang w:val="es-ES" w:eastAsia="es-ES" w:bidi="ar-SA"/>
+          <w14:ligatures w14:val="standardContextual"/>
+        </w:rPr>
+      </w:pPr>
+      <w:hyperlink w:anchor="_Toc221299571" w:history="1">
+        <w:r>
+          <w:rPr>
+            <w:rStyle w:val="Hiperligazn"/>
+            <w:rFonts w:ascii="Redzone" w:hAnsi="Redzone"/>
+            <w:noProof/>
+            <w:sz w:val="24"/>
+            <w:szCs w:val="24"/>
+          </w:rPr>
+          <w:t>2.1</w:t>
+        </w:r>
+        <w:r>
+          <w:rPr>
+            <w:rFonts w:ascii="Redzone" w:eastAsiaTheme="minorEastAsia" w:hAnsi="Redzone" w:cstheme="minorBidi"/>
+            <w:i w:val="0"/>
+            <w:iCs w:val="0"/>
+            <w:noProof/>
+            <w:sz w:val="24"/>
+            <w:szCs w:val="24"/>
+            <w:lang w:val="es-ES" w:eastAsia="es-ES" w:bidi="ar-SA"/>
+            <w14:ligatures w14:val="standardContextual"/>
+          </w:rPr>
+          <w:tab/>
+        </w:r>
+        <w:r>
+          <w:rPr>
+            <w:rStyle w:val="Hiperligazn"/>
+            <w:rFonts w:ascii="Redzone" w:hAnsi="Redzone"/>
+            <w:noProof/>
+            <w:sz w:val="24"/>
+            <w:szCs w:val="24"/>
+          </w:rPr>
+          <w:t>Convección</w:t>
+        </w:r>
+        <w:r>
+          <w:rPr>
+            <w:rFonts w:ascii="Redzone" w:hAnsi="Redzone"/>
+            <w:noProof/>
+            <w:webHidden/>
+            <w:sz w:val="24"/>
+            <w:szCs w:val="24"/>
+          </w:rPr>
+          <w:tab/>
+        </w:r>
+        <w:r>
+          <w:rPr>
+            <w:rFonts w:ascii="Redzone" w:hAnsi="Redzone"/>
+            <w:noProof/>
+            <w:webHidden/>
+            <w:sz w:val="24"/>
+            <w:szCs w:val="24"/>
+          </w:rPr>
+          <w:fldChar w:fldCharType="begin"/>
+        </w:r>
+        <w:r>
+          <w:rPr>
+            <w:rFonts w:ascii="Redzone" w:hAnsi="Redzone"/>
+            <w:noProof/>
+            <w:webHidden/>
+            <w:sz w:val="24"/>
+            <w:szCs w:val="24"/>
+          </w:rPr>
+          <w:instrText xml:space="preserve"> PAGEREF _Toc221299571 \h </w:instrText>
+        </w:r>
+        <w:r>
+          <w:rPr>
+            <w:rFonts w:ascii="Redzone" w:hAnsi="Redzone"/>
+            <w:noProof/>
+            <w:webHidden/>
+            <w:sz w:val="24"/>
+            <w:szCs w:val="24"/>
+          </w:rPr>
+        </w:r>
+        <w:r>
+          <w:rPr>
+            <w:rFonts w:ascii="Redzone" w:hAnsi="Redzone"/>
+            <w:noProof/>
+            <w:webHidden/>
+            <w:sz w:val="24"/>
+            <w:szCs w:val="24"/>
+          </w:rPr>
+          <w:fldChar w:fldCharType="separate"/>
+        </w:r>
+        <w:r>
+          <w:rPr>
+            <w:rFonts w:ascii="Redzone" w:hAnsi="Redzone"/>
+            <w:noProof/>
+            <w:webHidden/>
+            <w:sz w:val="24"/>
+            <w:szCs w:val="24"/>
+          </w:rPr>
+          <w:t>5</w:t>
+        </w:r>
+        <w:r>
+          <w:rPr>
+            <w:rFonts w:ascii="Redzone" w:hAnsi="Redzone"/>
+            <w:noProof/>
+            <w:webHidden/>
+            <w:sz w:val="24"/>
+            <w:szCs w:val="24"/>
+          </w:rPr>
+          <w:fldChar w:fldCharType="end"/>
+        </w:r>
+      </w:hyperlink>
+    </w:p>
+    <w:p>
+      <w:pPr>
+        <w:pStyle w:val="Tboadecontidos3"/>
+        <w:tabs>
+          <w:tab w:val="left" w:pos="960"/>
+          <w:tab w:val="right" w:leader="dot" w:pos="9628"/>
+        </w:tabs>
+        <w:rPr>
+          <w:rFonts w:ascii="Redzone" w:eastAsiaTheme="minorEastAsia" w:hAnsi="Redzone" w:cstheme="minorBidi"/>
+          <w:i w:val="0"/>
+          <w:iCs w:val="0"/>
+          <w:noProof/>
+          <w:sz w:val="24"/>
+          <w:szCs w:val="24"/>
+          <w:lang w:val="es-ES" w:eastAsia="es-ES" w:bidi="ar-SA"/>
+          <w14:ligatures w14:val="standardContextual"/>
+        </w:rPr>
+      </w:pPr>
+      <w:hyperlink w:anchor="_Toc221299572" w:history="1">
+        <w:r>
+          <w:rPr>
+            <w:rStyle w:val="Hiperligazn"/>
+            <w:rFonts w:ascii="Redzone" w:hAnsi="Redzone"/>
+            <w:noProof/>
+            <w:sz w:val="24"/>
+            <w:szCs w:val="24"/>
+          </w:rPr>
+          <w:t>2.2</w:t>
+        </w:r>
+        <w:r>
+          <w:rPr>
+            <w:rFonts w:ascii="Redzone" w:eastAsiaTheme="minorEastAsia" w:hAnsi="Redzone" w:cstheme="minorBidi"/>
+            <w:i w:val="0"/>
+            <w:iCs w:val="0"/>
+            <w:noProof/>
+            <w:sz w:val="24"/>
+            <w:szCs w:val="24"/>
+            <w:lang w:val="es-ES" w:eastAsia="es-ES" w:bidi="ar-SA"/>
+            <w14:ligatures w14:val="standardContextual"/>
+          </w:rPr>
+          <w:tab/>
+        </w:r>
+        <w:r>
+          <w:rPr>
+            <w:rStyle w:val="Hiperligazn"/>
+            <w:rFonts w:ascii="Redzone" w:hAnsi="Redzone"/>
+            <w:noProof/>
+            <w:sz w:val="24"/>
+            <w:szCs w:val="24"/>
+          </w:rPr>
+          <w:t>Radiación</w:t>
+        </w:r>
+        <w:r>
+          <w:rPr>
+            <w:rFonts w:ascii="Redzone" w:hAnsi="Redzone"/>
+            <w:noProof/>
+            <w:webHidden/>
+            <w:sz w:val="24"/>
+            <w:szCs w:val="24"/>
+          </w:rPr>
+          <w:tab/>
+        </w:r>
+        <w:r>
+          <w:rPr>
+            <w:rFonts w:ascii="Redzone" w:hAnsi="Redzone"/>
+            <w:noProof/>
+            <w:webHidden/>
+            <w:sz w:val="24"/>
+            <w:szCs w:val="24"/>
+          </w:rPr>
+          <w:fldChar w:fldCharType="begin"/>
+        </w:r>
+        <w:r>
+          <w:rPr>
+            <w:rFonts w:ascii="Redzone" w:hAnsi="Redzone"/>
+            <w:noProof/>
+            <w:webHidden/>
+            <w:sz w:val="24"/>
+            <w:szCs w:val="24"/>
+          </w:rPr>
+          <w:instrText xml:space="preserve"> PAGEREF _Toc221299572 \h </w:instrText>
+        </w:r>
+        <w:r>
+          <w:rPr>
+            <w:rFonts w:ascii="Redzone" w:hAnsi="Redzone"/>
+            <w:noProof/>
+            <w:webHidden/>
+            <w:sz w:val="24"/>
+            <w:szCs w:val="24"/>
+          </w:rPr>
+        </w:r>
+        <w:r>
+          <w:rPr>
+            <w:rFonts w:ascii="Redzone" w:hAnsi="Redzone"/>
+            <w:noProof/>
+            <w:webHidden/>
+            <w:sz w:val="24"/>
+            <w:szCs w:val="24"/>
+          </w:rPr>
+          <w:fldChar w:fldCharType="separate"/>
+        </w:r>
+        <w:r>
+          <w:rPr>
+            <w:rFonts w:ascii="Redzone" w:hAnsi="Redzone"/>
+            <w:noProof/>
+            <w:webHidden/>
+            <w:sz w:val="24"/>
+            <w:szCs w:val="24"/>
+          </w:rPr>
+          <w:t>6</w:t>
+        </w:r>
+        <w:r>
+          <w:rPr>
+            <w:rFonts w:ascii="Redzone" w:hAnsi="Redzone"/>
             <w:noProof/>
             <w:webHidden/>
             <w:sz w:val="24"/>
@@ -324,7 +584,7 @@
           <w:tab w:val="right" w:leader="dot" w:pos="9628"/>
         </w:tabs>
         <w:rPr>
-          <w:rFonts w:eastAsiaTheme="minorEastAsia" w:cstheme="minorBidi"/>
+          <w:rFonts w:ascii="Redzone" w:eastAsiaTheme="minorEastAsia" w:hAnsi="Redzone" w:cstheme="minorBidi"/>
           <w:smallCaps w:val="0"/>
           <w:noProof/>
           <w:sz w:val="24"/>
@@ -333,10 +593,11 @@
           <w14:ligatures w14:val="standardContextual"/>
         </w:rPr>
       </w:pPr>
-      <w:hyperlink w:anchor="_Toc217920024" w:history="1">
+      <w:hyperlink w:anchor="_Toc221299573" w:history="1">
         <w:r>
           <w:rPr>
             <w:rStyle w:val="Hiperligazn"/>
+            <w:rFonts w:ascii="Redzone" w:hAnsi="Redzone"/>
             <w:noProof/>
             <w:sz w:val="24"/>
             <w:szCs w:val="24"/>
@@ -345,7 +606,7 @@
         </w:r>
         <w:r>
           <w:rPr>
-            <w:rFonts w:eastAsiaTheme="minorEastAsia" w:cstheme="minorBidi"/>
+            <w:rFonts w:ascii="Redzone" w:eastAsiaTheme="minorEastAsia" w:hAnsi="Redzone" w:cstheme="minorBidi"/>
             <w:smallCaps w:val="0"/>
             <w:noProof/>
             <w:sz w:val="24"/>
@@ -358,6 +619,7 @@
         <w:r>
           <w:rPr>
             <w:rStyle w:val="Hiperligazn"/>
+            <w:rFonts w:ascii="Redzone" w:hAnsi="Redzone"/>
             <w:noProof/>
             <w:sz w:val="24"/>
             <w:szCs w:val="24"/>
@@ -366,6 +628,7 @@
         </w:r>
         <w:r>
           <w:rPr>
+            <w:rFonts w:ascii="Redzone" w:hAnsi="Redzone"/>
             <w:noProof/>
             <w:webHidden/>
             <w:sz w:val="24"/>
@@ -375,6 +638,7 @@
         </w:r>
         <w:r>
           <w:rPr>
+            <w:rFonts w:ascii="Redzone" w:hAnsi="Redzone"/>
             <w:noProof/>
             <w:webHidden/>
             <w:sz w:val="24"/>
@@ -384,23 +648,26 @@
         </w:r>
         <w:r>
           <w:rPr>
-            <w:noProof/>
-            <w:webHidden/>
-            <w:sz w:val="24"/>
-            <w:szCs w:val="24"/>
-          </w:rPr>
-          <w:instrText xml:space="preserve"> PAGEREF _Toc217920024 \h </w:instrText>
-        </w:r>
-        <w:r>
-          <w:rPr>
-            <w:noProof/>
-            <w:webHidden/>
-            <w:sz w:val="24"/>
-            <w:szCs w:val="24"/>
-          </w:rPr>
-        </w:r>
-        <w:r>
-          <w:rPr>
+            <w:rFonts w:ascii="Redzone" w:hAnsi="Redzone"/>
+            <w:noProof/>
+            <w:webHidden/>
+            <w:sz w:val="24"/>
+            <w:szCs w:val="24"/>
+          </w:rPr>
+          <w:instrText xml:space="preserve"> PAGEREF _Toc221299573 \h </w:instrText>
+        </w:r>
+        <w:r>
+          <w:rPr>
+            <w:rFonts w:ascii="Redzone" w:hAnsi="Redzone"/>
+            <w:noProof/>
+            <w:webHidden/>
+            <w:sz w:val="24"/>
+            <w:szCs w:val="24"/>
+          </w:rPr>
+        </w:r>
+        <w:r>
+          <w:rPr>
+            <w:rFonts w:ascii="Redzone" w:hAnsi="Redzone"/>
             <w:noProof/>
             <w:webHidden/>
             <w:sz w:val="24"/>
@@ -410,15 +677,17 @@
         </w:r>
         <w:r>
           <w:rPr>
-            <w:noProof/>
-            <w:webHidden/>
-            <w:sz w:val="24"/>
-            <w:szCs w:val="24"/>
-          </w:rPr>
-          <w:t>6</w:t>
-        </w:r>
-        <w:r>
-          <w:rPr>
+            <w:rFonts w:ascii="Redzone" w:hAnsi="Redzone"/>
+            <w:noProof/>
+            <w:webHidden/>
+            <w:sz w:val="24"/>
+            <w:szCs w:val="24"/>
+          </w:rPr>
+          <w:t>7</w:t>
+        </w:r>
+        <w:r>
+          <w:rPr>
+            <w:rFonts w:ascii="Redzone" w:hAnsi="Redzone"/>
             <w:noProof/>
             <w:webHidden/>
             <w:sz w:val="24"/>
@@ -436,7 +705,7 @@
           <w:tab w:val="right" w:leader="dot" w:pos="9628"/>
         </w:tabs>
         <w:rPr>
-          <w:rFonts w:eastAsiaTheme="minorEastAsia" w:cstheme="minorBidi"/>
+          <w:rFonts w:ascii="Redzone" w:eastAsiaTheme="minorEastAsia" w:hAnsi="Redzone" w:cstheme="minorBidi"/>
           <w:smallCaps w:val="0"/>
           <w:noProof/>
           <w:sz w:val="24"/>
@@ -445,10 +714,11 @@
           <w14:ligatures w14:val="standardContextual"/>
         </w:rPr>
       </w:pPr>
-      <w:hyperlink w:anchor="_Toc217920025" w:history="1">
+      <w:hyperlink w:anchor="_Toc221299574" w:history="1">
         <w:r>
           <w:rPr>
             <w:rStyle w:val="Hiperligazn"/>
+            <w:rFonts w:ascii="Redzone" w:hAnsi="Redzone"/>
             <w:noProof/>
             <w:sz w:val="24"/>
             <w:szCs w:val="24"/>
@@ -457,7 +727,7 @@
         </w:r>
         <w:r>
           <w:rPr>
-            <w:rFonts w:eastAsiaTheme="minorEastAsia" w:cstheme="minorBidi"/>
+            <w:rFonts w:ascii="Redzone" w:eastAsiaTheme="minorEastAsia" w:hAnsi="Redzone" w:cstheme="minorBidi"/>
             <w:smallCaps w:val="0"/>
             <w:noProof/>
             <w:sz w:val="24"/>
@@ -470,6 +740,7 @@
         <w:r>
           <w:rPr>
             <w:rStyle w:val="Hiperligazn"/>
+            <w:rFonts w:ascii="Redzone" w:hAnsi="Redzone"/>
             <w:noProof/>
             <w:sz w:val="24"/>
             <w:szCs w:val="24"/>
@@ -478,6 +749,7 @@
         </w:r>
         <w:r>
           <w:rPr>
+            <w:rFonts w:ascii="Redzone" w:hAnsi="Redzone"/>
             <w:noProof/>
             <w:webHidden/>
             <w:sz w:val="24"/>
@@ -487,6 +759,7 @@
         </w:r>
         <w:r>
           <w:rPr>
+            <w:rFonts w:ascii="Redzone" w:hAnsi="Redzone"/>
             <w:noProof/>
             <w:webHidden/>
             <w:sz w:val="24"/>
@@ -496,23 +769,26 @@
         </w:r>
         <w:r>
           <w:rPr>
-            <w:noProof/>
-            <w:webHidden/>
-            <w:sz w:val="24"/>
-            <w:szCs w:val="24"/>
-          </w:rPr>
-          <w:instrText xml:space="preserve"> PAGEREF _Toc217920025 \h </w:instrText>
-        </w:r>
-        <w:r>
-          <w:rPr>
-            <w:noProof/>
-            <w:webHidden/>
-            <w:sz w:val="24"/>
-            <w:szCs w:val="24"/>
-          </w:rPr>
-        </w:r>
-        <w:r>
-          <w:rPr>
+            <w:rFonts w:ascii="Redzone" w:hAnsi="Redzone"/>
+            <w:noProof/>
+            <w:webHidden/>
+            <w:sz w:val="24"/>
+            <w:szCs w:val="24"/>
+          </w:rPr>
+          <w:instrText xml:space="preserve"> PAGEREF _Toc221299574 \h </w:instrText>
+        </w:r>
+        <w:r>
+          <w:rPr>
+            <w:rFonts w:ascii="Redzone" w:hAnsi="Redzone"/>
+            <w:noProof/>
+            <w:webHidden/>
+            <w:sz w:val="24"/>
+            <w:szCs w:val="24"/>
+          </w:rPr>
+        </w:r>
+        <w:r>
+          <w:rPr>
+            <w:rFonts w:ascii="Redzone" w:hAnsi="Redzone"/>
             <w:noProof/>
             <w:webHidden/>
             <w:sz w:val="24"/>
@@ -522,15 +798,140 @@
         </w:r>
         <w:r>
           <w:rPr>
-            <w:noProof/>
-            <w:webHidden/>
-            <w:sz w:val="24"/>
-            <w:szCs w:val="24"/>
-          </w:rPr>
-          <w:t>7</w:t>
-        </w:r>
-        <w:r>
-          <w:rPr>
+            <w:rFonts w:ascii="Redzone" w:hAnsi="Redzone"/>
+            <w:noProof/>
+            <w:webHidden/>
+            <w:sz w:val="24"/>
+            <w:szCs w:val="24"/>
+          </w:rPr>
+          <w:t>8</w:t>
+        </w:r>
+        <w:r>
+          <w:rPr>
+            <w:rFonts w:ascii="Redzone" w:hAnsi="Redzone"/>
+            <w:noProof/>
+            <w:webHidden/>
+            <w:sz w:val="24"/>
+            <w:szCs w:val="24"/>
+          </w:rPr>
+          <w:fldChar w:fldCharType="end"/>
+        </w:r>
+      </w:hyperlink>
+    </w:p>
+    <w:p>
+      <w:pPr>
+        <w:pStyle w:val="Tboadecontidos3"/>
+        <w:tabs>
+          <w:tab w:val="left" w:pos="960"/>
+          <w:tab w:val="right" w:leader="dot" w:pos="9628"/>
+        </w:tabs>
+        <w:rPr>
+          <w:rFonts w:ascii="Redzone" w:eastAsiaTheme="minorEastAsia" w:hAnsi="Redzone" w:cstheme="minorBidi"/>
+          <w:i w:val="0"/>
+          <w:iCs w:val="0"/>
+          <w:noProof/>
+          <w:sz w:val="24"/>
+          <w:szCs w:val="24"/>
+          <w:lang w:val="es-ES" w:eastAsia="es-ES" w:bidi="ar-SA"/>
+          <w14:ligatures w14:val="standardContextual"/>
+        </w:rPr>
+      </w:pPr>
+      <w:hyperlink w:anchor="_Toc221299575" w:history="1">
+        <w:r>
+          <w:rPr>
+            <w:rStyle w:val="Hiperligazn"/>
+            <w:rFonts w:ascii="Redzone" w:hAnsi="Redzone"/>
+            <w:noProof/>
+            <w:sz w:val="24"/>
+            <w:szCs w:val="24"/>
+          </w:rPr>
+          <w:t>4.1</w:t>
+        </w:r>
+        <w:r>
+          <w:rPr>
+            <w:rFonts w:ascii="Redzone" w:eastAsiaTheme="minorEastAsia" w:hAnsi="Redzone" w:cstheme="minorBidi"/>
+            <w:i w:val="0"/>
+            <w:iCs w:val="0"/>
+            <w:noProof/>
+            <w:sz w:val="24"/>
+            <w:szCs w:val="24"/>
+            <w:lang w:val="es-ES" w:eastAsia="es-ES" w:bidi="ar-SA"/>
+            <w14:ligatures w14:val="standardContextual"/>
+          </w:rPr>
+          <w:tab/>
+        </w:r>
+        <w:r>
+          <w:rPr>
+            <w:rStyle w:val="Hiperligazn"/>
+            <w:rFonts w:ascii="Redzone" w:hAnsi="Redzone"/>
+            <w:noProof/>
+            <w:sz w:val="24"/>
+            <w:szCs w:val="24"/>
+          </w:rPr>
+          <w:t>A maqueta</w:t>
+        </w:r>
+        <w:r>
+          <w:rPr>
+            <w:rFonts w:ascii="Redzone" w:hAnsi="Redzone"/>
+            <w:noProof/>
+            <w:webHidden/>
+            <w:sz w:val="24"/>
+            <w:szCs w:val="24"/>
+          </w:rPr>
+          <w:tab/>
+        </w:r>
+        <w:r>
+          <w:rPr>
+            <w:rFonts w:ascii="Redzone" w:hAnsi="Redzone"/>
+            <w:noProof/>
+            <w:webHidden/>
+            <w:sz w:val="24"/>
+            <w:szCs w:val="24"/>
+          </w:rPr>
+          <w:fldChar w:fldCharType="begin"/>
+        </w:r>
+        <w:r>
+          <w:rPr>
+            <w:rFonts w:ascii="Redzone" w:hAnsi="Redzone"/>
+            <w:noProof/>
+            <w:webHidden/>
+            <w:sz w:val="24"/>
+            <w:szCs w:val="24"/>
+          </w:rPr>
+          <w:instrText xml:space="preserve"> PAGEREF _Toc221299575 \h </w:instrText>
+        </w:r>
+        <w:r>
+          <w:rPr>
+            <w:rFonts w:ascii="Redzone" w:hAnsi="Redzone"/>
+            <w:noProof/>
+            <w:webHidden/>
+            <w:sz w:val="24"/>
+            <w:szCs w:val="24"/>
+          </w:rPr>
+        </w:r>
+        <w:r>
+          <w:rPr>
+            <w:rFonts w:ascii="Redzone" w:hAnsi="Redzone"/>
+            <w:noProof/>
+            <w:webHidden/>
+            <w:sz w:val="24"/>
+            <w:szCs w:val="24"/>
+          </w:rPr>
+          <w:fldChar w:fldCharType="separate"/>
+        </w:r>
+        <w:r>
+          <w:rPr>
+            <w:rFonts w:ascii="Redzone" w:hAnsi="Redzone"/>
+            <w:noProof/>
+            <w:webHidden/>
+            <w:sz w:val="24"/>
+            <w:szCs w:val="24"/>
+          </w:rPr>
+          <w:t>8</w:t>
+        </w:r>
+        <w:r>
+          <w:rPr>
+            <w:rFonts w:ascii="Redzone" w:hAnsi="Redzone"/>
             <w:noProof/>
             <w:webHidden/>
             <w:sz w:val="24"/>
@@ -548,7 +949,7 @@
           <w:tab w:val="right" w:leader="dot" w:pos="9628"/>
         </w:tabs>
         <w:rPr>
-          <w:rFonts w:eastAsiaTheme="minorEastAsia" w:cstheme="minorBidi"/>
+          <w:rFonts w:ascii="Redzone" w:eastAsiaTheme="minorEastAsia" w:hAnsi="Redzone" w:cstheme="minorBidi"/>
           <w:smallCaps w:val="0"/>
           <w:noProof/>
           <w:sz w:val="24"/>
@@ -557,10 +958,11 @@
           <w14:ligatures w14:val="standardContextual"/>
         </w:rPr>
       </w:pPr>
-      <w:hyperlink w:anchor="_Toc217920026" w:history="1">
+      <w:hyperlink w:anchor="_Toc221299576" w:history="1">
         <w:r>
           <w:rPr>
             <w:rStyle w:val="Hiperligazn"/>
+            <w:rFonts w:ascii="Redzone" w:hAnsi="Redzone"/>
             <w:noProof/>
             <w:sz w:val="24"/>
             <w:szCs w:val="24"/>
@@ -569,7 +971,7 @@
         </w:r>
         <w:r>
           <w:rPr>
-            <w:rFonts w:eastAsiaTheme="minorEastAsia" w:cstheme="minorBidi"/>
+            <w:rFonts w:ascii="Redzone" w:eastAsiaTheme="minorEastAsia" w:hAnsi="Redzone" w:cstheme="minorBidi"/>
             <w:smallCaps w:val="0"/>
             <w:noProof/>
             <w:sz w:val="24"/>
@@ -582,6 +984,7 @@
         <w:r>
           <w:rPr>
             <w:rStyle w:val="Hiperligazn"/>
+            <w:rFonts w:ascii="Redzone" w:hAnsi="Redzone"/>
             <w:noProof/>
             <w:sz w:val="24"/>
             <w:szCs w:val="24"/>
@@ -590,6 +993,7 @@
         </w:r>
         <w:r>
           <w:rPr>
+            <w:rFonts w:ascii="Redzone" w:hAnsi="Redzone"/>
             <w:noProof/>
             <w:webHidden/>
             <w:sz w:val="24"/>
@@ -599,6 +1003,7 @@
         </w:r>
         <w:r>
           <w:rPr>
+            <w:rFonts w:ascii="Redzone" w:hAnsi="Redzone"/>
             <w:noProof/>
             <w:webHidden/>
             <w:sz w:val="24"/>
@@ -608,23 +1013,26 @@
         </w:r>
         <w:r>
           <w:rPr>
-            <w:noProof/>
-            <w:webHidden/>
-            <w:sz w:val="24"/>
-            <w:szCs w:val="24"/>
-          </w:rPr>
-          <w:instrText xml:space="preserve"> PAGEREF _Toc217920026 \h </w:instrText>
-        </w:r>
-        <w:r>
-          <w:rPr>
-            <w:noProof/>
-            <w:webHidden/>
-            <w:sz w:val="24"/>
-            <w:szCs w:val="24"/>
-          </w:rPr>
-        </w:r>
-        <w:r>
-          <w:rPr>
+            <w:rFonts w:ascii="Redzone" w:hAnsi="Redzone"/>
+            <w:noProof/>
+            <w:webHidden/>
+            <w:sz w:val="24"/>
+            <w:szCs w:val="24"/>
+          </w:rPr>
+          <w:instrText xml:space="preserve"> PAGEREF _Toc221299576 \h </w:instrText>
+        </w:r>
+        <w:r>
+          <w:rPr>
+            <w:rFonts w:ascii="Redzone" w:hAnsi="Redzone"/>
+            <w:noProof/>
+            <w:webHidden/>
+            <w:sz w:val="24"/>
+            <w:szCs w:val="24"/>
+          </w:rPr>
+        </w:r>
+        <w:r>
+          <w:rPr>
+            <w:rFonts w:ascii="Redzone" w:hAnsi="Redzone"/>
             <w:noProof/>
             <w:webHidden/>
             <w:sz w:val="24"/>
@@ -634,15 +1042,17 @@
         </w:r>
         <w:r>
           <w:rPr>
-            <w:noProof/>
-            <w:webHidden/>
-            <w:sz w:val="24"/>
-            <w:szCs w:val="24"/>
-          </w:rPr>
-          <w:t>8</w:t>
-        </w:r>
-        <w:r>
-          <w:rPr>
+            <w:rFonts w:ascii="Redzone" w:hAnsi="Redzone"/>
+            <w:noProof/>
+            <w:webHidden/>
+            <w:sz w:val="24"/>
+            <w:szCs w:val="24"/>
+          </w:rPr>
+          <w:t>9</w:t>
+        </w:r>
+        <w:r>
+          <w:rPr>
+            <w:rFonts w:ascii="Redzone" w:hAnsi="Redzone"/>
             <w:noProof/>
             <w:webHidden/>
             <w:sz w:val="24"/>
@@ -660,7 +1070,7 @@
           <w:tab w:val="right" w:leader="dot" w:pos="9628"/>
         </w:tabs>
         <w:rPr>
-          <w:rFonts w:eastAsiaTheme="minorEastAsia" w:cstheme="minorBidi"/>
+          <w:rFonts w:ascii="Redzone" w:eastAsiaTheme="minorEastAsia" w:hAnsi="Redzone" w:cstheme="minorBidi"/>
           <w:smallCaps w:val="0"/>
           <w:noProof/>
           <w:sz w:val="24"/>
@@ -669,10 +1079,11 @@
           <w14:ligatures w14:val="standardContextual"/>
         </w:rPr>
       </w:pPr>
-      <w:hyperlink w:anchor="_Toc217920027" w:history="1">
+      <w:hyperlink w:anchor="_Toc221299577" w:history="1">
         <w:r>
           <w:rPr>
             <w:rStyle w:val="Hiperligazn"/>
+            <w:rFonts w:ascii="Redzone" w:hAnsi="Redzone"/>
             <w:noProof/>
             <w:sz w:val="24"/>
             <w:szCs w:val="24"/>
@@ -681,7 +1092,7 @@
         </w:r>
         <w:r>
           <w:rPr>
-            <w:rFonts w:eastAsiaTheme="minorEastAsia" w:cstheme="minorBidi"/>
+            <w:rFonts w:ascii="Redzone" w:eastAsiaTheme="minorEastAsia" w:hAnsi="Redzone" w:cstheme="minorBidi"/>
             <w:smallCaps w:val="0"/>
             <w:noProof/>
             <w:sz w:val="24"/>
@@ -694,14 +1105,16 @@
         <w:r>
           <w:rPr>
             <w:rStyle w:val="Hiperligazn"/>
-            <w:noProof/>
-            <w:sz w:val="24"/>
-            <w:szCs w:val="24"/>
-          </w:rPr>
-          <w:t>Discusión</w:t>
-        </w:r>
-        <w:r>
-          <w:rPr>
+            <w:rFonts w:ascii="Redzone" w:hAnsi="Redzone"/>
+            <w:noProof/>
+            <w:sz w:val="24"/>
+            <w:szCs w:val="24"/>
+          </w:rPr>
+          <w:t>Conclusións</w:t>
+        </w:r>
+        <w:r>
+          <w:rPr>
+            <w:rFonts w:ascii="Redzone" w:hAnsi="Redzone"/>
             <w:noProof/>
             <w:webHidden/>
             <w:sz w:val="24"/>
@@ -711,6 +1124,7 @@
         </w:r>
         <w:r>
           <w:rPr>
+            <w:rFonts w:ascii="Redzone" w:hAnsi="Redzone"/>
             <w:noProof/>
             <w:webHidden/>
             <w:sz w:val="24"/>
@@ -720,23 +1134,26 @@
         </w:r>
         <w:r>
           <w:rPr>
-            <w:noProof/>
-            <w:webHidden/>
-            <w:sz w:val="24"/>
-            <w:szCs w:val="24"/>
-          </w:rPr>
-          <w:instrText xml:space="preserve"> PAGEREF _Toc217920027 \h </w:instrText>
-        </w:r>
-        <w:r>
-          <w:rPr>
-            <w:noProof/>
-            <w:webHidden/>
-            <w:sz w:val="24"/>
-            <w:szCs w:val="24"/>
-          </w:rPr>
-        </w:r>
-        <w:r>
-          <w:rPr>
+            <w:rFonts w:ascii="Redzone" w:hAnsi="Redzone"/>
+            <w:noProof/>
+            <w:webHidden/>
+            <w:sz w:val="24"/>
+            <w:szCs w:val="24"/>
+          </w:rPr>
+          <w:instrText xml:space="preserve"> PAGEREF _Toc221299577 \h </w:instrText>
+        </w:r>
+        <w:r>
+          <w:rPr>
+            <w:rFonts w:ascii="Redzone" w:hAnsi="Redzone"/>
+            <w:noProof/>
+            <w:webHidden/>
+            <w:sz w:val="24"/>
+            <w:szCs w:val="24"/>
+          </w:rPr>
+        </w:r>
+        <w:r>
+          <w:rPr>
+            <w:rFonts w:ascii="Redzone" w:hAnsi="Redzone"/>
             <w:noProof/>
             <w:webHidden/>
             <w:sz w:val="24"/>
@@ -746,15 +1163,17 @@
         </w:r>
         <w:r>
           <w:rPr>
-            <w:noProof/>
-            <w:webHidden/>
-            <w:sz w:val="24"/>
-            <w:szCs w:val="24"/>
-          </w:rPr>
-          <w:t>9</w:t>
-        </w:r>
-        <w:r>
-          <w:rPr>
+            <w:rFonts w:ascii="Redzone" w:hAnsi="Redzone"/>
+            <w:noProof/>
+            <w:webHidden/>
+            <w:sz w:val="24"/>
+            <w:szCs w:val="24"/>
+          </w:rPr>
+          <w:t>10</w:t>
+        </w:r>
+        <w:r>
+          <w:rPr>
+            <w:rFonts w:ascii="Redzone" w:hAnsi="Redzone"/>
             <w:noProof/>
             <w:webHidden/>
             <w:sz w:val="24"/>
@@ -772,7 +1191,7 @@
           <w:tab w:val="right" w:leader="dot" w:pos="9628"/>
         </w:tabs>
         <w:rPr>
-          <w:rFonts w:eastAsiaTheme="minorEastAsia" w:cstheme="minorBidi"/>
+          <w:rFonts w:ascii="Redzone" w:eastAsiaTheme="minorEastAsia" w:hAnsi="Redzone" w:cstheme="minorBidi"/>
           <w:smallCaps w:val="0"/>
           <w:noProof/>
           <w:sz w:val="24"/>
@@ -781,10 +1200,11 @@
           <w14:ligatures w14:val="standardContextual"/>
         </w:rPr>
       </w:pPr>
-      <w:hyperlink w:anchor="_Toc217920028" w:history="1">
+      <w:hyperlink w:anchor="_Toc221299578" w:history="1">
         <w:r>
           <w:rPr>
             <w:rStyle w:val="Hiperligazn"/>
+            <w:rFonts w:ascii="Redzone" w:hAnsi="Redzone"/>
             <w:noProof/>
             <w:sz w:val="24"/>
             <w:szCs w:val="24"/>
@@ -793,7 +1213,7 @@
         </w:r>
         <w:r>
           <w:rPr>
-            <w:rFonts w:eastAsiaTheme="minorEastAsia" w:cstheme="minorBidi"/>
+            <w:rFonts w:ascii="Redzone" w:eastAsiaTheme="minorEastAsia" w:hAnsi="Redzone" w:cstheme="minorBidi"/>
             <w:smallCaps w:val="0"/>
             <w:noProof/>
             <w:sz w:val="24"/>
@@ -806,14 +1226,16 @@
         <w:r>
           <w:rPr>
             <w:rStyle w:val="Hiperligazn"/>
-            <w:noProof/>
-            <w:sz w:val="24"/>
-            <w:szCs w:val="24"/>
-          </w:rPr>
-          <w:t>Conclusións</w:t>
-        </w:r>
-        <w:r>
-          <w:rPr>
+            <w:rFonts w:ascii="Redzone" w:hAnsi="Redzone"/>
+            <w:noProof/>
+            <w:sz w:val="24"/>
+            <w:szCs w:val="24"/>
+          </w:rPr>
+          <w:t>Bibliografía</w:t>
+        </w:r>
+        <w:r>
+          <w:rPr>
+            <w:rFonts w:ascii="Redzone" w:hAnsi="Redzone"/>
             <w:noProof/>
             <w:webHidden/>
             <w:sz w:val="24"/>
@@ -823,6 +1245,7 @@
         </w:r>
         <w:r>
           <w:rPr>
+            <w:rFonts w:ascii="Redzone" w:hAnsi="Redzone"/>
             <w:noProof/>
             <w:webHidden/>
             <w:sz w:val="24"/>
@@ -832,23 +1255,26 @@
         </w:r>
         <w:r>
           <w:rPr>
-            <w:noProof/>
-            <w:webHidden/>
-            <w:sz w:val="24"/>
-            <w:szCs w:val="24"/>
-          </w:rPr>
-          <w:instrText xml:space="preserve"> PAGEREF _Toc217920028 \h </w:instrText>
-        </w:r>
-        <w:r>
-          <w:rPr>
-            <w:noProof/>
-            <w:webHidden/>
-            <w:sz w:val="24"/>
-            <w:szCs w:val="24"/>
-          </w:rPr>
-        </w:r>
-        <w:r>
-          <w:rPr>
+            <w:rFonts w:ascii="Redzone" w:hAnsi="Redzone"/>
+            <w:noProof/>
+            <w:webHidden/>
+            <w:sz w:val="24"/>
+            <w:szCs w:val="24"/>
+          </w:rPr>
+          <w:instrText xml:space="preserve"> PAGEREF _Toc221299578 \h </w:instrText>
+        </w:r>
+        <w:r>
+          <w:rPr>
+            <w:rFonts w:ascii="Redzone" w:hAnsi="Redzone"/>
+            <w:noProof/>
+            <w:webHidden/>
+            <w:sz w:val="24"/>
+            <w:szCs w:val="24"/>
+          </w:rPr>
+        </w:r>
+        <w:r>
+          <w:rPr>
+            <w:rFonts w:ascii="Redzone" w:hAnsi="Redzone"/>
             <w:noProof/>
             <w:webHidden/>
             <w:sz w:val="24"/>
@@ -858,15 +1284,17 @@
         </w:r>
         <w:r>
           <w:rPr>
-            <w:noProof/>
-            <w:webHidden/>
-            <w:sz w:val="24"/>
-            <w:szCs w:val="24"/>
-          </w:rPr>
-          <w:t>10</w:t>
-        </w:r>
-        <w:r>
-          <w:rPr>
+            <w:rFonts w:ascii="Redzone" w:hAnsi="Redzone"/>
+            <w:noProof/>
+            <w:webHidden/>
+            <w:sz w:val="24"/>
+            <w:szCs w:val="24"/>
+          </w:rPr>
+          <w:t>11</w:t>
+        </w:r>
+        <w:r>
+          <w:rPr>
+            <w:rFonts w:ascii="Redzone" w:hAnsi="Redzone"/>
             <w:noProof/>
             <w:webHidden/>
             <w:sz w:val="24"/>
@@ -880,10 +1308,11 @@
       <w:pPr>
         <w:pStyle w:val="Tboadecontidos2"/>
         <w:tabs>
+          <w:tab w:val="left" w:pos="720"/>
           <w:tab w:val="right" w:leader="dot" w:pos="9628"/>
         </w:tabs>
         <w:rPr>
-          <w:rFonts w:eastAsiaTheme="minorEastAsia" w:cstheme="minorBidi"/>
+          <w:rFonts w:ascii="Redzone" w:eastAsiaTheme="minorEastAsia" w:hAnsi="Redzone" w:cstheme="minorBidi"/>
           <w:smallCaps w:val="0"/>
           <w:noProof/>
           <w:sz w:val="24"/>
@@ -892,27 +1321,52 @@
           <w14:ligatures w14:val="standardContextual"/>
         </w:rPr>
       </w:pPr>
-      <w:hyperlink w:anchor="_Toc217920029" w:history="1">
+      <w:hyperlink w:anchor="_Toc221299579" w:history="1">
         <w:r>
           <w:rPr>
             <w:rStyle w:val="Hiperligazn"/>
-            <w:noProof/>
-            <w:sz w:val="24"/>
-            <w:szCs w:val="24"/>
-          </w:rPr>
-          <w:t>Bibliografía</w:t>
-        </w:r>
-        <w:r>
-          <w:rPr>
-            <w:noProof/>
-            <w:webHidden/>
-            <w:sz w:val="24"/>
-            <w:szCs w:val="24"/>
+            <w:rFonts w:ascii="Redzone" w:hAnsi="Redzone"/>
+            <w:noProof/>
+            <w:sz w:val="24"/>
+            <w:szCs w:val="24"/>
+          </w:rPr>
+          <w:t>8.</w:t>
+        </w:r>
+        <w:r>
+          <w:rPr>
+            <w:rFonts w:ascii="Redzone" w:eastAsiaTheme="minorEastAsia" w:hAnsi="Redzone" w:cstheme="minorBidi"/>
+            <w:smallCaps w:val="0"/>
+            <w:noProof/>
+            <w:sz w:val="24"/>
+            <w:szCs w:val="24"/>
+            <w:lang w:val="es-ES" w:eastAsia="es-ES" w:bidi="ar-SA"/>
+            <w14:ligatures w14:val="standardContextual"/>
           </w:rPr>
           <w:tab/>
         </w:r>
         <w:r>
           <w:rPr>
+            <w:rStyle w:val="Hiperligazn"/>
+            <w:rFonts w:ascii="Redzone" w:hAnsi="Redzone"/>
+            <w:noProof/>
+            <w:sz w:val="24"/>
+            <w:szCs w:val="24"/>
+          </w:rPr>
+          <w:t>Ecuacións</w:t>
+        </w:r>
+        <w:r>
+          <w:rPr>
+            <w:rFonts w:ascii="Redzone" w:hAnsi="Redzone"/>
+            <w:noProof/>
+            <w:webHidden/>
+            <w:sz w:val="24"/>
+            <w:szCs w:val="24"/>
+          </w:rPr>
+          <w:tab/>
+        </w:r>
+        <w:r>
+          <w:rPr>
+            <w:rFonts w:ascii="Redzone" w:hAnsi="Redzone"/>
             <w:noProof/>
             <w:webHidden/>
             <w:sz w:val="24"/>
@@ -922,23 +1376,26 @@
         </w:r>
         <w:r>
           <w:rPr>
-            <w:noProof/>
-            <w:webHidden/>
-            <w:sz w:val="24"/>
-            <w:szCs w:val="24"/>
-          </w:rPr>
-          <w:instrText xml:space="preserve"> PAGEREF _Toc217920029 \h </w:instrText>
-        </w:r>
-        <w:r>
-          <w:rPr>
-            <w:noProof/>
-            <w:webHidden/>
-            <w:sz w:val="24"/>
-            <w:szCs w:val="24"/>
-          </w:rPr>
-        </w:r>
-        <w:r>
-          <w:rPr>
+            <w:rFonts w:ascii="Redzone" w:hAnsi="Redzone"/>
+            <w:noProof/>
+            <w:webHidden/>
+            <w:sz w:val="24"/>
+            <w:szCs w:val="24"/>
+          </w:rPr>
+          <w:instrText xml:space="preserve"> PAGEREF _Toc221299579 \h </w:instrText>
+        </w:r>
+        <w:r>
+          <w:rPr>
+            <w:rFonts w:ascii="Redzone" w:hAnsi="Redzone"/>
+            <w:noProof/>
+            <w:webHidden/>
+            <w:sz w:val="24"/>
+            <w:szCs w:val="24"/>
+          </w:rPr>
+        </w:r>
+        <w:r>
+          <w:rPr>
+            <w:rFonts w:ascii="Redzone" w:hAnsi="Redzone"/>
             <w:noProof/>
             <w:webHidden/>
             <w:sz w:val="24"/>
@@ -948,6 +1405,7 @@
         </w:r>
         <w:r>
           <w:rPr>
+            <w:rFonts w:ascii="Redzone" w:hAnsi="Redzone"/>
             <w:noProof/>
             <w:webHidden/>
             <w:sz w:val="24"/>
@@ -957,6 +1415,7 @@
         </w:r>
         <w:r>
           <w:rPr>
+            <w:rFonts w:ascii="Redzone" w:hAnsi="Redzone"/>
             <w:noProof/>
             <w:webHidden/>
             <w:sz w:val="24"/>
@@ -970,16 +1429,22 @@
       <w:pPr>
         <w:jc w:val="left"/>
         <w:rPr>
-          <w:rFonts w:ascii="Redzone Med" w:eastAsia="Microsoft YaHei" w:hAnsi="Redzone Med"/>
+          <w:rFonts w:ascii="Redzone" w:eastAsia="Microsoft YaHei" w:hAnsi="Redzone"/>
           <w:bCs/>
           <w:sz w:val="32"/>
           <w:szCs w:val="32"/>
         </w:rPr>
       </w:pPr>
       <w:r>
+        <w:rPr>
+          <w:rFonts w:ascii="Redzone" w:hAnsi="Redzone"/>
+        </w:rPr>
         <w:fldChar w:fldCharType="end"/>
       </w:r>
       <w:r>
+        <w:rPr>
+          <w:rFonts w:ascii="Redzone" w:hAnsi="Redzone"/>
+        </w:rPr>
         <w:br w:type="page"/>
       </w:r>
     </w:p>
@@ -987,25 +1452,20 @@
       <w:pPr>
         <w:pStyle w:val="Ttulo2"/>
       </w:pPr>
-      <w:bookmarkStart w:id="2" w:name="_Toc217920022"/>
+      <w:bookmarkStart w:id="4" w:name="_Toc221299569"/>
       <w:r>
         <w:lastRenderedPageBreak/>
         <w:t>Introdución</w:t>
       </w:r>
-      <w:bookmarkEnd w:id="2"/>
+      <w:bookmarkEnd w:id="4"/>
     </w:p>
     <w:p>
       <w:pPr>
         <w:pStyle w:val="Textodocorpo"/>
       </w:pPr>
       <w:r>
-        <w:t xml:space="preserve">Na Galiza o consumo enerxético total foi de 4.869 </w:t>
-      </w:r>
-      <w:proofErr w:type="spellStart"/>
-      <w:r>
-        <w:t>ktep</w:t>
-      </w:r>
-      <w:proofErr w:type="spellEnd"/>
+        <w:t>Na Galiza o consumo enerxético total foi de 4.869 ktep</w:t>
+      </w:r>
       <w:r>
         <w:rPr>
           <w:rStyle w:val="Referenciadenotaaopdepxina"/>
@@ -1015,11 +1475,9 @@
       <w:r>
         <w:t xml:space="preserve"> dos cales as vivendas galegas representaron 699 </w:t>
       </w:r>
-      <w:proofErr w:type="spellStart"/>
       <w:r>
         <w:t>ktep</w:t>
       </w:r>
-      <w:proofErr w:type="spellEnd"/>
       <w:r>
         <w:t xml:space="preserve">, o 14,4% </w:t>
       </w:r>
@@ -1078,10 +1536,7 @@
         <w:t>n</w:t>
       </w:r>
       <w:r>
-        <w:t>este proxecto analizaremos as distintas variables que inflúen de xeito directo no consumo dos fogares</w:t>
-      </w:r>
-      <w:r>
-        <w:t>. Con este obxectivo construiremos un prototipo que simule as condicións dunha vivenda</w:t>
+        <w:t>este proxecto analizaremos as distintas variables que inflúen de xeito directo no consumo dos fogares. Con este obxectivo construiremos un prototipo que simule as condicións dunha vivenda</w:t>
       </w:r>
       <w:r>
         <w:t xml:space="preserve"> para a</w:t>
@@ -1093,19 +1548,13 @@
         <w:t>a</w:t>
       </w:r>
       <w:r>
-        <w:t>r</w:t>
-      </w:r>
-      <w:r>
-        <w:t>mo</w:t>
+        <w:t>rmo</w:t>
       </w:r>
       <w:r>
         <w:t>s as</w:t>
       </w:r>
       <w:r>
-        <w:t xml:space="preserve"> </w:t>
-      </w:r>
-      <w:r>
-        <w:t xml:space="preserve">distintas variables do entorno para determinarmos </w:t>
+        <w:t xml:space="preserve"> distintas variables do entorno para determinarmos </w:t>
       </w:r>
       <w:r>
         <w:t>que configuración de materias e illamento é mellor</w:t>
@@ -1135,10 +1584,7 @@
         <w:t xml:space="preserve">así </w:t>
       </w:r>
       <w:r>
-        <w:t>poder</w:t>
-      </w:r>
-      <w:r>
-        <w:t xml:space="preserve"> reducir o </w:t>
+        <w:t xml:space="preserve">poder reducir o </w:t>
       </w:r>
       <w:r>
         <w:t>consumo</w:t>
@@ -1162,12 +1608,12 @@
       <w:pPr>
         <w:pStyle w:val="Ttulo2"/>
       </w:pPr>
-      <w:bookmarkStart w:id="3" w:name="_Toc217920023"/>
+      <w:bookmarkStart w:id="5" w:name="_Toc221299570"/>
       <w:r>
         <w:lastRenderedPageBreak/>
         <w:t>Estado do coñecemento</w:t>
       </w:r>
-      <w:bookmarkEnd w:id="3"/>
+      <w:bookmarkEnd w:id="5"/>
     </w:p>
     <w:p>
       <w:pPr>
@@ -1232,7 +1678,6 @@
           <w:id w:val="-99573613"/>
           <w:citation/>
         </w:sdtPr>
-        <w:sdtEndPr/>
         <w:sdtContent>
           <w:r>
             <w:fldChar w:fldCharType="begin"/>
@@ -1395,9 +1840,11 @@
       <w:pPr>
         <w:pStyle w:val="Ttulo3"/>
       </w:pPr>
+      <w:bookmarkStart w:id="6" w:name="_Toc221299571"/>
       <w:r>
         <w:t>Convección</w:t>
       </w:r>
+      <w:bookmarkEnd w:id="6"/>
     </w:p>
     <w:p>
       <w:pPr>
@@ -1496,6 +1943,9 @@
             </m:e>
             <m:sub>
               <m:r>
+                <m:rPr>
+                  <m:sty m:val="p"/>
+                </m:rPr>
                 <w:rPr>
                   <w:rFonts w:ascii="Cambria Math" w:hAnsi="Cambria Math"/>
                 </w:rPr>
@@ -1514,7 +1964,6 @@
               <m:ctrlPr>
                 <w:rPr>
                   <w:rFonts w:ascii="Cambria Math" w:hAnsi="Cambria Math"/>
-                  <w:i/>
                 </w:rPr>
               </m:ctrlPr>
             </m:dPr>
@@ -1530,14 +1979,25 @@
                 </m:sSubPr>
                 <m:e>
                   <m:r>
+                    <m:rPr>
+                      <m:sty m:val="p"/>
+                    </m:rPr>
                     <w:rPr>
                       <w:rFonts w:ascii="Cambria Math" w:hAnsi="Cambria Math"/>
                     </w:rPr>
                     <m:t>t</m:t>
                   </m:r>
+                  <m:ctrlPr>
+                    <w:rPr>
+                      <w:rFonts w:ascii="Cambria Math" w:hAnsi="Cambria Math"/>
+                    </w:rPr>
+                  </m:ctrlPr>
                 </m:e>
                 <m:sub>
                   <m:r>
+                    <m:rPr>
+                      <m:sty m:val="p"/>
+                    </m:rPr>
                     <w:rPr>
                       <w:rFonts w:ascii="Cambria Math" w:hAnsi="Cambria Math"/>
                     </w:rPr>
@@ -1562,6 +2022,9 @@
                 </m:sSubPr>
                 <m:e>
                   <m:r>
+                    <m:rPr>
+                      <m:sty m:val="p"/>
+                    </m:rPr>
                     <w:rPr>
                       <w:rFonts w:ascii="Cambria Math" w:hAnsi="Cambria Math"/>
                     </w:rPr>
@@ -1570,6 +2033,9 @@
                 </m:e>
                 <m:sub>
                   <m:r>
+                    <m:rPr>
+                      <m:sty m:val="p"/>
+                    </m:rPr>
                     <w:rPr>
                       <w:rFonts w:ascii="Cambria Math" w:hAnsi="Cambria Math"/>
                     </w:rPr>
@@ -1577,6 +2043,12 @@
                   </m:r>
                 </m:sub>
               </m:sSub>
+              <m:ctrlPr>
+                <w:rPr>
+                  <w:rFonts w:ascii="Cambria Math" w:hAnsi="Cambria Math"/>
+                  <w:i/>
+                </w:rPr>
+              </m:ctrlPr>
             </m:e>
           </m:d>
           <m:sSub>
@@ -1590,14 +2062,25 @@
             </m:sSubPr>
             <m:e>
               <m:r>
+                <m:rPr>
+                  <m:sty m:val="p"/>
+                </m:rPr>
                 <w:rPr>
                   <w:rFonts w:ascii="Cambria Math" w:hAnsi="Cambria Math"/>
                 </w:rPr>
                 <m:t>a</m:t>
               </m:r>
+              <m:ctrlPr>
+                <w:rPr>
+                  <w:rFonts w:ascii="Cambria Math" w:hAnsi="Cambria Math"/>
+                </w:rPr>
+              </m:ctrlPr>
             </m:e>
             <m:sub>
               <m:r>
+                <m:rPr>
+                  <m:sty m:val="p"/>
+                </m:rPr>
                 <w:rPr>
                   <w:rFonts w:ascii="Cambria Math" w:hAnsi="Cambria Math"/>
                 </w:rPr>
@@ -1613,7 +2096,7 @@
         <w:pStyle w:val="Lenda"/>
         <w:jc w:val="right"/>
       </w:pPr>
-      <w:bookmarkStart w:id="4" w:name="_Toc220770995"/>
+      <w:bookmarkStart w:id="7" w:name="_Toc221299257"/>
       <w:r>
         <w:t xml:space="preserve">Ecuación </w:t>
       </w:r>
@@ -1624,8 +2107,17 @@
           </w:rPr>
           <w:t>1</w:t>
         </w:r>
-        <w:bookmarkEnd w:id="4"/>
       </w:fldSimple>
+      <w:r>
+        <w:t>: Calor cedido por convección</w:t>
+      </w:r>
+      <w:bookmarkEnd w:id="7"/>
+    </w:p>
+    <w:p>
+      <w:pPr>
+        <w:pStyle w:val="Lenda"/>
+        <w:jc w:val="right"/>
+      </w:pPr>
     </w:p>
     <w:p>
       <w:pPr>
@@ -1633,19 +2125,34 @@
         <w:ind w:left="709"/>
       </w:pPr>
       <w:r>
-        <w:t>O valor de a</w:t>
+        <w:t xml:space="preserve">O valor de </w:t>
+      </w:r>
+      <w:proofErr w:type="spellStart"/>
+      <w:r>
+        <w:t>a</w:t>
       </w:r>
       <w:r>
         <w:rPr>
           <w:vertAlign w:val="subscript"/>
         </w:rPr>
-        <w:t xml:space="preserve">c </w:t>
+        <w:t>c</w:t>
+      </w:r>
+      <w:proofErr w:type="spellEnd"/>
+      <w:r>
+        <w:rPr>
+          <w:vertAlign w:val="subscript"/>
+        </w:rPr>
+        <w:t xml:space="preserve"> </w:t>
       </w:r>
       <w:r>
         <w:t xml:space="preserve">depende da velocidade das correntes de aire, canto maior sexa esta, máis importantes </w:t>
       </w:r>
       <w:r>
-        <w:t xml:space="preserve">serán os cambios na temperatura superficial do corpo. Este fenómeno chámase </w:t>
+        <w:t xml:space="preserve">serán os cambios na temperatura superficial do corpo. Este </w:t>
+      </w:r>
+      <w:r>
+        <w:lastRenderedPageBreak/>
+        <w:t xml:space="preserve">fenómeno chámase </w:t>
       </w:r>
       <w:r>
         <w:rPr>
@@ -1655,11 +2162,7 @@
         <w:t>convección natural</w:t>
       </w:r>
       <w:r>
-        <w:t xml:space="preserve"> mais, cando é causado por correntes de aire </w:t>
-      </w:r>
-      <w:r>
-        <w:lastRenderedPageBreak/>
-        <w:t xml:space="preserve">derivadas de apertura de portas, movemento de obxectos, etc. chámase </w:t>
+        <w:t xml:space="preserve"> mais, cando é causado por correntes de aire derivadas de apertura de portas, movemento de obxectos, etc. chámase </w:t>
       </w:r>
       <w:r>
         <w:rPr>
@@ -1685,14 +2188,16 @@
       <w:pPr>
         <w:pStyle w:val="Ttulo3"/>
       </w:pPr>
+      <w:bookmarkStart w:id="8" w:name="_Toc221299572"/>
       <w:r>
         <w:t>Radiación</w:t>
       </w:r>
+      <w:bookmarkEnd w:id="8"/>
     </w:p>
     <w:p>
       <w:pPr>
         <w:pStyle w:val="Textodocorpo"/>
-        <w:ind w:left="709"/>
+        <w:ind w:left="1418"/>
       </w:pPr>
     </w:p>
     <w:p>
@@ -1715,11 +2220,19 @@
           </m:sSubPr>
           <m:e>
             <m:r>
+              <m:rPr>
+                <m:sty m:val="p"/>
+              </m:rPr>
               <w:rPr>
                 <w:rFonts w:ascii="Cambria Math" w:hAnsi="Cambria Math"/>
               </w:rPr>
               <m:t>t</m:t>
             </m:r>
+            <m:ctrlPr>
+              <w:rPr>
+                <w:rFonts w:ascii="Cambria Math" w:hAnsi="Cambria Math"/>
+              </w:rPr>
+            </m:ctrlPr>
           </m:e>
           <m:sub>
             <m:r>
@@ -1747,6 +2260,9 @@
           </m:sSubPr>
           <m:e>
             <m:r>
+              <m:rPr>
+                <m:sty m:val="p"/>
+              </m:rPr>
               <w:rPr>
                 <w:rFonts w:ascii="Cambria Math" w:hAnsi="Cambria Math"/>
               </w:rPr>
@@ -1778,14 +2294,25 @@
           </m:sSubPr>
           <m:e>
             <m:r>
+              <m:rPr>
+                <m:sty m:val="p"/>
+              </m:rPr>
               <w:rPr>
                 <w:rFonts w:ascii="Cambria Math" w:hAnsi="Cambria Math" w:cs="Arial"/>
               </w:rPr>
               <m:t>α</m:t>
             </m:r>
+            <m:ctrlPr>
+              <w:rPr>
+                <w:rFonts w:ascii="Cambria Math" w:hAnsi="Cambria Math" w:cs="Arial"/>
+              </w:rPr>
+            </m:ctrlPr>
           </m:e>
           <m:sub>
             <m:r>
+              <m:rPr>
+                <m:sty m:val="p"/>
+              </m:rPr>
               <w:rPr>
                 <w:rFonts w:ascii="Cambria Math" w:hAnsi="Cambria Math" w:cs="Arial"/>
               </w:rPr>
@@ -1799,6 +2326,9 @@
       </w:r>
       <m:oMath>
         <m:r>
+          <m:rPr>
+            <m:sty m:val="p"/>
+          </m:rPr>
           <w:rPr>
             <w:rFonts w:ascii="Cambria Math" w:hAnsi="Cambria Math"/>
           </w:rPr>
@@ -1813,7 +2343,7 @@
       <w:pPr>
         <w:pStyle w:val="Textodocorpo"/>
         <w:keepNext/>
-        <w:ind w:left="709"/>
+        <w:ind w:left="1418"/>
       </w:pPr>
       <m:oMathPara>
         <m:oMath>
@@ -1838,6 +2368,9 @@
             </m:e>
             <m:sub>
               <m:r>
+                <m:rPr>
+                  <m:sty m:val="p"/>
+                </m:rPr>
                 <w:rPr>
                   <w:rFonts w:ascii="Cambria Math" w:hAnsi="Cambria Math"/>
                 </w:rPr>
@@ -1856,7 +2389,6 @@
               <m:ctrlPr>
                 <w:rPr>
                   <w:rFonts w:ascii="Cambria Math" w:hAnsi="Cambria Math"/>
-                  <w:i/>
                 </w:rPr>
               </m:ctrlPr>
             </m:dPr>
@@ -1872,11 +2404,19 @@
                 </m:sSubPr>
                 <m:e>
                   <m:r>
+                    <m:rPr>
+                      <m:sty m:val="p"/>
+                    </m:rPr>
                     <w:rPr>
                       <w:rFonts w:ascii="Cambria Math" w:hAnsi="Cambria Math"/>
                     </w:rPr>
                     <m:t>t</m:t>
                   </m:r>
+                  <m:ctrlPr>
+                    <w:rPr>
+                      <w:rFonts w:ascii="Cambria Math" w:hAnsi="Cambria Math"/>
+                    </w:rPr>
+                  </m:ctrlPr>
                 </m:e>
                 <m:sub>
                   <m:r>
@@ -1904,6 +2444,9 @@
                 </m:sSubPr>
                 <m:e>
                   <m:r>
+                    <m:rPr>
+                      <m:sty m:val="p"/>
+                    </m:rPr>
                     <w:rPr>
                       <w:rFonts w:ascii="Cambria Math" w:hAnsi="Cambria Math"/>
                     </w:rPr>
@@ -1919,6 +2462,12 @@
                   </m:r>
                 </m:sub>
               </m:sSub>
+              <m:ctrlPr>
+                <w:rPr>
+                  <w:rFonts w:ascii="Cambria Math" w:hAnsi="Cambria Math"/>
+                  <w:i/>
+                </w:rPr>
+              </m:ctrlPr>
             </m:e>
           </m:d>
           <m:sSub>
@@ -1932,14 +2481,25 @@
             </m:sSubPr>
             <m:e>
               <m:r>
+                <m:rPr>
+                  <m:sty m:val="p"/>
+                </m:rPr>
                 <w:rPr>
                   <w:rFonts w:ascii="Cambria Math" w:hAnsi="Cambria Math"/>
                 </w:rPr>
                 <m:t>α</m:t>
               </m:r>
+              <m:ctrlPr>
+                <w:rPr>
+                  <w:rFonts w:ascii="Cambria Math" w:hAnsi="Cambria Math"/>
+                </w:rPr>
+              </m:ctrlPr>
             </m:e>
             <m:sub>
               <m:r>
+                <m:rPr>
+                  <m:sty m:val="p"/>
+                </m:rPr>
                 <w:rPr>
                   <w:rFonts w:ascii="Cambria Math" w:hAnsi="Cambria Math"/>
                 </w:rPr>
@@ -1948,6 +2508,9 @@
             </m:sub>
           </m:sSub>
           <m:r>
+            <m:rPr>
+              <m:sty m:val="p"/>
+            </m:rPr>
             <w:rPr>
               <w:rFonts w:ascii="Cambria Math" w:hAnsi="Cambria Math"/>
             </w:rPr>
@@ -1959,27 +2522,186 @@
     <w:p>
       <w:pPr>
         <w:pStyle w:val="Lenda"/>
+        <w:ind w:left="709"/>
+        <w:jc w:val="right"/>
+      </w:pPr>
+      <w:bookmarkStart w:id="9" w:name="_Toc221299258"/>
+      <w:r>
+        <w:t xml:space="preserve">Ecuación </w:t>
+      </w:r>
+      <w:fldSimple w:instr=" SEQ Ecuación \* ARABIC ">
+        <w:r>
+          <w:rPr>
+            <w:noProof/>
+          </w:rPr>
+          <w:t>2</w:t>
+        </w:r>
+      </w:fldSimple>
+      <w:r>
+        <w:t>: Calor cedido por radiación</w:t>
+      </w:r>
+      <w:bookmarkEnd w:id="9"/>
+    </w:p>
+    <w:p>
+      <w:pPr>
+        <w:pStyle w:val="Lenda"/>
+        <w:ind w:left="709"/>
+        <w:jc w:val="right"/>
+      </w:pPr>
+    </w:p>
+    <w:p>
+      <w:pPr>
+        <w:pStyle w:val="Textodocorpo"/>
+        <w:ind w:left="709"/>
+      </w:pPr>
+      <w:r>
+        <w:t>Entón o illamento defínese como o proceso de reducir o fluxo de calor, e vén dado por unha constante de condutividade térmica diferente en cada material. O fluxo defínese como:</w:t>
+      </w:r>
+    </w:p>
+    <w:bookmarkStart w:id="10" w:name="FluxoRadiación"/>
+    <w:p>
+      <w:pPr>
+        <w:pStyle w:val="Textodocorpo"/>
+        <w:keepNext/>
+        <w:ind w:left="709"/>
+      </w:pPr>
+      <m:oMathPara>
+        <m:oMath>
+          <m:acc>
+            <m:accPr>
+              <m:chr m:val="⃗"/>
+              <m:ctrlPr>
+                <w:rPr>
+                  <w:rFonts w:ascii="Cambria Math" w:hAnsi="Cambria Math"/>
+                </w:rPr>
+              </m:ctrlPr>
+            </m:accPr>
+            <m:e>
+              <m:r>
+                <m:rPr>
+                  <m:sty m:val="p"/>
+                </m:rPr>
+                <w:rPr>
+                  <w:rFonts w:ascii="Cambria Math" w:hAnsi="Cambria Math"/>
+                </w:rPr>
+                <m:t>q</m:t>
+              </m:r>
+            </m:e>
+          </m:acc>
+          <m:r>
+            <w:rPr>
+              <w:rFonts w:ascii="Cambria Math" w:hAnsi="Cambria Math"/>
+            </w:rPr>
+            <m:t>=-</m:t>
+          </m:r>
+          <m:r>
+            <m:rPr>
+              <m:sty m:val="p"/>
+            </m:rPr>
+            <w:rPr>
+              <w:rFonts w:ascii="Cambria Math" w:hAnsi="Cambria Math"/>
+            </w:rPr>
+            <m:t>k∇T</m:t>
+          </m:r>
+        </m:oMath>
+      </m:oMathPara>
+    </w:p>
+    <w:p>
+      <w:pPr>
+        <w:pStyle w:val="Lenda"/>
+        <w:ind w:left="709"/>
+        <w:jc w:val="right"/>
+      </w:pPr>
+      <w:bookmarkStart w:id="11" w:name="_Toc221299259"/>
+      <w:bookmarkEnd w:id="10"/>
+      <w:r>
+        <w:t xml:space="preserve">Ecuación </w:t>
+      </w:r>
+      <w:fldSimple w:instr=" SEQ Ecuación \* ARABIC ">
+        <w:r>
+          <w:rPr>
+            <w:noProof/>
+          </w:rPr>
+          <w:t>3</w:t>
+        </w:r>
+      </w:fldSimple>
+      <w:r>
+        <w:t>: Fluxo en radiación</w:t>
+      </w:r>
+      <w:bookmarkEnd w:id="11"/>
+    </w:p>
+    <w:p>
+      <w:pPr>
+        <w:pStyle w:val="Lenda"/>
+        <w:ind w:left="709"/>
         <w:jc w:val="right"/>
         <w:rPr>
           <w:i w:val="0"/>
         </w:rPr>
       </w:pPr>
-      <w:r>
-        <w:t xml:space="preserve">Ecuación </w:t>
-      </w:r>
-      <w:fldSimple w:instr=" SEQ Ecuación \* ARABIC ">
-        <w:r>
-          <w:rPr>
-            <w:noProof/>
-          </w:rPr>
-          <w:t>2</w:t>
-        </w:r>
-      </w:fldSimple>
     </w:p>
     <w:p>
       <w:pPr>
         <w:pStyle w:val="Textodocorpo"/>
-      </w:pPr>
+        <w:ind w:left="709"/>
+      </w:pPr>
+      <w:r>
+        <w:t xml:space="preserve">Onde </w:t>
+      </w:r>
+      <m:oMath>
+        <m:acc>
+          <m:accPr>
+            <m:chr m:val="⃗"/>
+            <m:ctrlPr>
+              <w:rPr>
+                <w:rFonts w:ascii="Cambria Math" w:hAnsi="Cambria Math"/>
+              </w:rPr>
+            </m:ctrlPr>
+          </m:accPr>
+          <m:e>
+            <m:r>
+              <w:rPr>
+                <w:rFonts w:ascii="Cambria Math" w:hAnsi="Cambria Math"/>
+              </w:rPr>
+              <m:t>q</m:t>
+            </m:r>
+          </m:e>
+        </m:acc>
+      </m:oMath>
+      <w:r>
+        <w:t xml:space="preserve"> é o fluxo de calor, </w:t>
+      </w:r>
+      <m:oMath>
+        <m:r>
+          <w:rPr>
+            <w:rFonts w:ascii="Cambria Math" w:hAnsi="Cambria Math"/>
+          </w:rPr>
+          <m:t>k</m:t>
+        </m:r>
+      </m:oMath>
+      <w:r>
+        <w:t xml:space="preserve"> é a constante de condutividade térmica e </w:t>
+      </w:r>
+      <m:oMath>
+        <m:r>
+          <m:rPr>
+            <m:sty m:val="p"/>
+          </m:rPr>
+          <w:rPr>
+            <w:rFonts w:ascii="Cambria Math" w:hAnsi="Cambria Math"/>
+          </w:rPr>
+          <m:t>∇</m:t>
+        </m:r>
+        <m:r>
+          <w:rPr>
+            <w:rFonts w:ascii="Cambria Math" w:hAnsi="Cambria Math"/>
+          </w:rPr>
+          <m:t>T</m:t>
+        </m:r>
+      </m:oMath>
+      <w:r>
+        <w:t xml:space="preserve"> é o gradiente térmico.</w:t>
+      </w:r>
     </w:p>
     <w:p>
       <w:pPr>
@@ -1988,7 +2710,14 @@
     </w:p>
     <w:p>
       <w:pPr>
-        <w:pStyle w:val="Textodocorpo"/>
+        <w:jc w:val="left"/>
+        <w:rPr>
+          <w:rFonts w:ascii="Liberation Sans" w:eastAsia="Microsoft YaHei" w:hAnsi="Liberation Sans"/>
+          <w:b/>
+          <w:bCs/>
+          <w:sz w:val="28"/>
+          <w:szCs w:val="28"/>
+        </w:rPr>
       </w:pPr>
       <w:r>
         <w:br w:type="page"/>
@@ -1996,14 +2725,349 @@
     </w:p>
     <w:p>
       <w:pPr>
+        <w:pStyle w:val="Ttulo3"/>
+      </w:pPr>
+      <w:r>
+        <w:lastRenderedPageBreak/>
+        <w:t>Arduino</w:t>
+      </w:r>
+    </w:p>
+    <w:p>
+      <w:pPr>
+        <w:pStyle w:val="Ttulo3"/>
+        <w:numPr>
+          <w:ilvl w:val="0"/>
+          <w:numId w:val="0"/>
+        </w:numPr>
+        <w:ind w:left="709"/>
+      </w:pPr>
+    </w:p>
+    <w:p>
+      <w:pPr>
+        <w:ind w:left="709"/>
+      </w:pPr>
+      <w:bookmarkStart w:id="12" w:name="_Toc221299573"/>
+      <w:r>
+        <w:t>Para poder realizar a comparación da capacidade illante dun material</w:t>
+      </w:r>
+      <w:r>
+        <w:t xml:space="preserve"> precisamos de sensores para medir temperatura, humidade e intensidade luminosa; tanto no  interior coma no exterior da maqueta. </w:t>
+      </w:r>
+      <w:r>
+        <w:t>Os sensores que valoramos empregar foron:</w:t>
+      </w:r>
+    </w:p>
+    <w:p/>
+    <w:p>
+      <w:pPr>
+        <w:pStyle w:val="Pargrafodelista"/>
+        <w:numPr>
+          <w:ilvl w:val="0"/>
+          <w:numId w:val="13"/>
+        </w:numPr>
+      </w:pPr>
+      <w:r>
+        <w:t>Sensor DHT11</w:t>
+      </w:r>
+      <w:sdt>
+        <w:sdtPr>
+          <w:id w:val="-1084688437"/>
+          <w:citation/>
+        </w:sdtPr>
+        <w:sdtContent>
+          <w:r>
+            <w:fldChar w:fldCharType="begin"/>
+          </w:r>
+          <w:r>
+            <w:instrText xml:space="preserve">CITATION DHT11 \l 1110 </w:instrText>
+          </w:r>
+          <w:r>
+            <w:fldChar w:fldCharType="separate"/>
+          </w:r>
+          <w:r>
+            <w:rPr>
+              <w:noProof/>
+            </w:rPr>
+            <w:t xml:space="preserve"> (OSEPP Electronics)</w:t>
+          </w:r>
+          <w:r>
+            <w:fldChar w:fldCharType="end"/>
+          </w:r>
+        </w:sdtContent>
+      </w:sdt>
+      <w:r>
+        <w:t>.</w:t>
+      </w:r>
+      <w:r>
+        <w:t xml:space="preserve"> </w:t>
+      </w:r>
+      <w:r>
+        <w:t>M</w:t>
+      </w:r>
+      <w:r>
+        <w:t xml:space="preserve">ide humidade e temperatura </w:t>
+      </w:r>
+      <w:r>
+        <w:t>c</w:t>
+      </w:r>
+      <w:r>
+        <w:t>un rango de medida de 0ºC - 50ºC e de 20-90 %RH (a 25ºC)</w:t>
+      </w:r>
+      <w:r>
+        <w:t xml:space="preserve">, </w:t>
+      </w:r>
+      <w:r>
+        <w:t xml:space="preserve">cunha precisión de </w:t>
+      </w:r>
+      <w:r>
+        <w:rPr>
+          <w:rFonts w:cs="Arial"/>
+        </w:rPr>
+        <w:t>±</w:t>
+      </w:r>
+      <w:r>
+        <w:t xml:space="preserve">2ºC para temperatura e </w:t>
+      </w:r>
+      <w:r>
+        <w:rPr>
+          <w:rFonts w:cs="Arial"/>
+        </w:rPr>
+        <w:t>±</w:t>
+      </w:r>
+      <w:r>
+        <w:t xml:space="preserve">5%RH para humidade. </w:t>
+      </w:r>
+    </w:p>
+    <w:p>
+      <w:pPr>
+        <w:pStyle w:val="Pargrafodelista"/>
+        <w:numPr>
+          <w:ilvl w:val="0"/>
+          <w:numId w:val="13"/>
+        </w:numPr>
+      </w:pPr>
+      <w:r>
+        <w:t xml:space="preserve">Sensor DHT22 </w:t>
+      </w:r>
+      <w:sdt>
+        <w:sdtPr>
+          <w:id w:val="297664800"/>
+          <w:citation/>
+        </w:sdtPr>
+        <w:sdtContent>
+          <w:r>
+            <w:fldChar w:fldCharType="begin"/>
+          </w:r>
+          <w:r>
+            <w:instrText xml:space="preserve"> CITATION DHT22 \l 1110 </w:instrText>
+          </w:r>
+          <w:r>
+            <w:fldChar w:fldCharType="separate"/>
+          </w:r>
+          <w:r>
+            <w:rPr>
+              <w:noProof/>
+            </w:rPr>
+            <w:t>(Adafruit Industries, 2025)</w:t>
+          </w:r>
+          <w:r>
+            <w:fldChar w:fldCharType="end"/>
+          </w:r>
+        </w:sdtContent>
+      </w:sdt>
+      <w:r>
+        <w:t>.</w:t>
+      </w:r>
+      <w:r>
+        <w:t xml:space="preserve"> </w:t>
+      </w:r>
+      <w:r>
+        <w:t xml:space="preserve">Mide humidade e temperatura cun rango de medida de </w:t>
+      </w:r>
+      <w:r>
+        <w:t>-40ºC - 80</w:t>
+      </w:r>
+      <w:r>
+        <w:t>ºC e de 0-</w:t>
+      </w:r>
+      <w:r>
+        <w:t>10</w:t>
+      </w:r>
+      <w:r>
+        <w:t xml:space="preserve">0 %RH (a 25ºC), cunha precisión de </w:t>
+      </w:r>
+      <w:r>
+        <w:rPr>
+          <w:rFonts w:cs="Arial"/>
+        </w:rPr>
+        <w:t>±</w:t>
+      </w:r>
+      <w:r>
+        <w:t>0.5</w:t>
+      </w:r>
+      <w:r>
+        <w:t xml:space="preserve">ºC para temperatura e </w:t>
+      </w:r>
+      <w:r>
+        <w:rPr>
+          <w:rFonts w:cs="Arial"/>
+        </w:rPr>
+        <w:t>±</w:t>
+      </w:r>
+      <w:r>
+        <w:rPr>
+          <w:rFonts w:cs="Arial"/>
+        </w:rPr>
+        <w:t>2-</w:t>
+      </w:r>
+      <w:r>
+        <w:t xml:space="preserve">5%RH para humidade. </w:t>
+      </w:r>
+    </w:p>
+    <w:p>
+      <w:pPr>
+        <w:pStyle w:val="Pargrafodelista"/>
+        <w:numPr>
+          <w:ilvl w:val="0"/>
+          <w:numId w:val="13"/>
+        </w:numPr>
+      </w:pPr>
+      <w:r>
+        <w:t xml:space="preserve">Sensor DS18B20 </w:t>
+      </w:r>
+      <w:sdt>
+        <w:sdtPr>
+          <w:id w:val="-950160423"/>
+          <w:citation/>
+        </w:sdtPr>
+        <w:sdtContent>
+          <w:r>
+            <w:fldChar w:fldCharType="begin"/>
+          </w:r>
+          <w:r>
+            <w:instrText xml:space="preserve"> CITATION DS18B20 \l 1110 </w:instrText>
+          </w:r>
+          <w:r>
+            <w:fldChar w:fldCharType="separate"/>
+          </w:r>
+          <w:r>
+            <w:rPr>
+              <w:noProof/>
+            </w:rPr>
+            <w:t>(Soldered)</w:t>
+          </w:r>
+          <w:r>
+            <w:fldChar w:fldCharType="end"/>
+          </w:r>
+        </w:sdtContent>
+      </w:sdt>
+      <w:r>
+        <w:t xml:space="preserve">. Mide temperatura cun rango de -55ºC a 125ºC cunha precisión de </w:t>
+      </w:r>
+      <w:r>
+        <w:rPr>
+          <w:rFonts w:cs="Arial"/>
+        </w:rPr>
+        <w:t>±</w:t>
+      </w:r>
+      <w:r>
+        <w:t>0.5ºC</w:t>
+      </w:r>
+    </w:p>
+    <w:p>
+      <w:pPr>
+        <w:pStyle w:val="Pargrafodelista"/>
+        <w:numPr>
+          <w:ilvl w:val="0"/>
+          <w:numId w:val="13"/>
+        </w:numPr>
+      </w:pPr>
+      <w:proofErr w:type="spellStart"/>
+      <w:r>
+        <w:t>Termopar</w:t>
+      </w:r>
+      <w:proofErr w:type="spellEnd"/>
+      <w:r>
+        <w:t xml:space="preserve"> MAX6675 </w:t>
+      </w:r>
+      <w:sdt>
+        <w:sdtPr>
+          <w:id w:val="1137993327"/>
+          <w:citation/>
+        </w:sdtPr>
+        <w:sdtContent>
+          <w:r>
+            <w:fldChar w:fldCharType="begin"/>
+          </w:r>
+          <w:r>
+            <w:instrText xml:space="preserve"> CITATION MAX6675 \l 1110 </w:instrText>
+          </w:r>
+          <w:r>
+            <w:fldChar w:fldCharType="separate"/>
+          </w:r>
+          <w:r>
+            <w:rPr>
+              <w:noProof/>
+            </w:rPr>
+            <w:t>(Maxim Integrated Products, 2021)</w:t>
+          </w:r>
+          <w:r>
+            <w:fldChar w:fldCharType="end"/>
+          </w:r>
+        </w:sdtContent>
+      </w:sdt>
+      <w:r>
+        <w:t xml:space="preserve">. Mide temperaturas nun rango de </w:t>
+      </w:r>
+      <w:r>
+        <w:t>-20°C to +85°C</w:t>
+      </w:r>
+      <w:r>
+        <w:t>.</w:t>
+      </w:r>
+    </w:p>
+    <w:p>
+      <w:pPr>
+        <w:pStyle w:val="Pargrafodelista"/>
+        <w:numPr>
+          <w:ilvl w:val="0"/>
+          <w:numId w:val="13"/>
+        </w:numPr>
+      </w:pPr>
+      <w:r>
+        <w:t>Fotorresistencia</w:t>
+      </w:r>
+      <w:r>
+        <w:t>, detecta o brillo e intensidade de luz do entorno, pódese axustar a sensibilidade mediante un potenciómetro. Tensión de funcionamento de entre 3,3V a 5V.</w:t>
+      </w:r>
+    </w:p>
+    <w:p>
+      <w:pPr>
+        <w:pStyle w:val="Pargrafodelista"/>
+        <w:numPr>
+          <w:ilvl w:val="0"/>
+          <w:numId w:val="13"/>
+        </w:numPr>
+        <w:rPr>
+          <w:rFonts w:ascii="Redzone Med" w:eastAsia="Microsoft YaHei" w:hAnsi="Redzone Med"/>
+          <w:bCs/>
+          <w:sz w:val="32"/>
+          <w:szCs w:val="32"/>
+        </w:rPr>
+      </w:pPr>
+      <w:r>
+        <w:br w:type="page"/>
+      </w:r>
+    </w:p>
+    <w:p>
+      <w:pPr>
         <w:pStyle w:val="Ttulo2"/>
       </w:pPr>
-      <w:bookmarkStart w:id="5" w:name="_Toc217920024"/>
       <w:r>
         <w:lastRenderedPageBreak/>
         <w:t>Obxectivos</w:t>
       </w:r>
-      <w:bookmarkEnd w:id="5"/>
+      <w:bookmarkEnd w:id="12"/>
     </w:p>
     <w:p>
       <w:pPr>
@@ -2068,13 +3132,8 @@
           <w:numId w:val="2"/>
         </w:numPr>
       </w:pPr>
-      <w:proofErr w:type="spellStart"/>
-      <w:r>
-        <w:t>Implementación</w:t>
-      </w:r>
-      <w:proofErr w:type="spellEnd"/>
-      <w:r>
-        <w:t xml:space="preserve"> do sistema electrónico </w:t>
+      <w:r>
+        <w:t xml:space="preserve">Implementación do sistema electrónico </w:t>
       </w:r>
       <w:r>
         <w:t>na maqueta e posta en funcionamento do prototipo.</w:t>
@@ -2099,12 +3158,12 @@
       <w:pPr>
         <w:pStyle w:val="Ttulo2"/>
       </w:pPr>
-      <w:bookmarkStart w:id="6" w:name="_Toc217920025"/>
+      <w:bookmarkStart w:id="13" w:name="_Toc221299574"/>
       <w:r>
         <w:lastRenderedPageBreak/>
         <w:t>Material e método</w:t>
       </w:r>
-      <w:bookmarkEnd w:id="6"/>
+      <w:bookmarkEnd w:id="13"/>
     </w:p>
     <w:p>
       <w:pPr>
@@ -2121,6 +3180,16 @@
     </w:p>
     <w:p>
       <w:pPr>
+        <w:pStyle w:val="Ttulo3"/>
+      </w:pPr>
+      <w:bookmarkStart w:id="14" w:name="_Toc221299575"/>
+      <w:r>
+        <w:t>A maqueta</w:t>
+      </w:r>
+      <w:bookmarkEnd w:id="14"/>
+    </w:p>
+    <w:p>
+      <w:pPr>
         <w:pStyle w:val="Textodocorpo"/>
       </w:pPr>
       <w:r>
@@ -2155,125 +3224,89 @@
         <w:t xml:space="preserve"> descartamos esta posibilidade por </w:t>
       </w:r>
       <w:r>
-        <w:t xml:space="preserve">non ser práctica, </w:t>
+        <w:t>non ser práctica</w:t>
+      </w:r>
+      <w:r>
+        <w:t>, xa que ao non expoñer directamente o prototipo as condicións naturais</w:t>
+      </w:r>
+      <w:r>
+        <w:t>,</w:t>
+      </w:r>
+      <w:r>
+        <w:t xml:space="preserve"> facelo empregando fontes de luz e calor artificiais resulta máis sinxelo.</w:t>
+      </w:r>
+    </w:p>
+    <w:p>
+      <w:pPr>
+        <w:pStyle w:val="Textodocorpo"/>
+      </w:pPr>
+    </w:p>
+    <w:p>
+      <w:pPr>
+        <w:pStyle w:val="Textodocorpo"/>
+      </w:pPr>
+      <w:r>
+        <w:t xml:space="preserve">Logo, o proceso de deseño comezou pola creación dos planos das 5 caras da maqueta, decidimos empregar contrachapado, polo que para facer as pezas precisabamos deseñar as siluetas en dixital e logo empregar unha cortadora láser. Estes deseños dixitais fixémolos empregando </w:t>
+      </w:r>
+      <w:r>
+        <w:t>unha ferramenta web chamada MakerCase</w:t>
+      </w:r>
+      <w:r>
+        <w:rPr>
+          <w:rStyle w:val="Referenciadenotaaopdepxina"/>
+        </w:rPr>
+        <w:footnoteReference w:id="2"/>
+      </w:r>
+      <w:r>
+        <w:t>, esta páxina permitiunos ter os deseños básicos, en formato .svg, que tivemos que editar empregando Inkscape. Unha vez axustados os deseños exportámolos en formato .wmf para que puidesen ser procesados pola impresora láser. O proceso de corte ca impresora láser foi máis doado, só fixo falta axustar a posición inicial do láser respecto as táboas de contrachapado, axustar a intensidade do láser e repetir o proceso para tódalas pezas.</w:t>
+      </w:r>
+      <w:r>
+        <w:t xml:space="preserve"> </w:t>
+      </w:r>
+      <w:r>
+        <w:t xml:space="preserve">O resultado foron múltiples pezas, tres dedicadas a ser o parte interior, outras tres para as caras exteriores e </w:t>
+      </w:r>
+      <w:r>
+        <w:t>as restantes para limitar as áreas onde aplicaremos o material illante.</w:t>
+      </w:r>
+    </w:p>
+    <w:p>
+      <w:pPr>
+        <w:pStyle w:val="Textodocorpo"/>
+      </w:pPr>
+    </w:p>
+    <w:p>
+      <w:pPr>
+        <w:pStyle w:val="Textodocorpo"/>
+      </w:pPr>
+      <w:r>
+        <w:t>Proseguimos co proceso de montada no cal empregamos parafusos, porcas e argolas para aportar estabilidade ás táboas e poder aplicar o illante sen que se deformase a estrutura. Aplicamos o material illante</w:t>
       </w:r>
       <w:r>
         <w:rPr>
           <w:color w:val="EE0000"/>
         </w:rPr>
-        <w:t>xa que deseñar, imprimir en 3D e instalar as persianas na maqueta supuña moitos máis problemas que simplemente cambiar as condicións luminosas de xeito externo na fase experimental.</w:t>
-      </w:r>
-    </w:p>
-    <w:p>
-      <w:pPr>
-        <w:pStyle w:val="Textodocorpo"/>
-      </w:pPr>
-    </w:p>
-    <w:p>
-      <w:pPr>
-        <w:pStyle w:val="Textodocorpo"/>
-      </w:pPr>
-      <w:r>
-        <w:t xml:space="preserve">Finalmente optamos por un deseño no que as paredes laterais e anterior contiñas un capa de illante </w:t>
+        <w:t>[[Especificacións]]</w:t>
       </w:r>
       <w:r>
         <w:rPr>
           <w:color w:val="EE0000"/>
         </w:rPr>
-        <w:t>[[De que está feito o illante]]</w:t>
-      </w:r>
-      <w:r>
-        <w:t xml:space="preserve">, na fachada posterior </w:t>
+        <w:t xml:space="preserve"> </w:t>
+      </w:r>
+      <w:r>
+        <w:t>e ensamblamos toda a estrutura.</w:t>
       </w:r>
     </w:p>
     <w:p>
       <w:pPr>
         <w:pStyle w:val="Textodocorpo"/>
       </w:pPr>
-      <w:r>
-        <w:rPr>
-          <w:color w:val="EE0000"/>
-          <w:sz w:val="40"/>
-          <w:szCs w:val="40"/>
-        </w:rPr>
-        <w:t>Describir a forma final da maqueta</w:t>
-      </w:r>
-      <w:r>
-        <w:br/>
-      </w:r>
     </w:p>
     <w:p>
       <w:pPr>
         <w:pStyle w:val="Textodocorpo"/>
       </w:pPr>
-      <w:r>
-        <w:t>Así mesmo, cada fachada está composta por pezas de</w:t>
-      </w:r>
-      <w:r>
-        <w:t xml:space="preserve"> </w:t>
-      </w:r>
-      <w:proofErr w:type="spellStart"/>
-      <w:r>
-        <w:t>contrachapado</w:t>
-      </w:r>
-      <w:proofErr w:type="spellEnd"/>
-      <w:r>
-        <w:t xml:space="preserve"> </w:t>
-      </w:r>
-      <w:r>
-        <w:t>que deseñamos mediante o programa informático</w:t>
-      </w:r>
-      <w:r>
-        <w:t xml:space="preserve"> de deseño</w:t>
-      </w:r>
-      <w:r>
-        <w:t xml:space="preserve"> </w:t>
-      </w:r>
-      <w:r>
-        <w:rPr>
-          <w:i/>
-          <w:iCs/>
-        </w:rPr>
-        <w:t>inkscape</w:t>
-      </w:r>
-      <w:r>
-        <w:t>. Para poder ensamblar sinxelamente as distintas pezas optamos por facer fendeduras</w:t>
-      </w:r>
-      <w:r>
-        <w:t xml:space="preserve"> ou “dedos”</w:t>
-      </w:r>
-      <w:r>
-        <w:t xml:space="preserve"> nos laterais destas para que encaixen nas pezas contiguas. Unha vez rematada a fase de deseño continuamo</w:t>
-      </w:r>
-      <w:r>
-        <w:t>s co</w:t>
-      </w:r>
-      <w:r>
-        <w:t xml:space="preserve"> proceso de construción empregando unha cortadora láser para cortar táboas de</w:t>
-      </w:r>
-      <w:r>
-        <w:t xml:space="preserve"> </w:t>
-      </w:r>
-      <w:proofErr w:type="spellStart"/>
-      <w:r>
-        <w:t>contrachapado</w:t>
-      </w:r>
-      <w:proofErr w:type="spellEnd"/>
-      <w:r>
-        <w:t xml:space="preserve">. </w:t>
-      </w:r>
-      <w:r>
-        <w:t xml:space="preserve">Para sustentar a estrutura fixemos catro piares, que se atopan no oco que forman as pezas ao encaixaren entre elas. Así, cun listón de madeira e unha serra circular </w:t>
-      </w:r>
-      <w:r>
-        <w:t xml:space="preserve">cortámo-las </w:t>
-      </w:r>
-      <w:r>
-        <w:t>catro columnas.</w:t>
-      </w:r>
-      <w:r>
-        <w:t xml:space="preserve"> No canto das tres paredes que contan con illante, co fin de aportar estabilidade tanto a estrutura como no intre de aplica-la escuma </w:t>
-      </w:r>
     </w:p>
     <w:p>
       <w:pPr>
@@ -2282,11 +3315,6 @@
     </w:p>
     <w:p>
       <w:pPr>
-        <w:pStyle w:val="Textodocorpo"/>
-      </w:pPr>
-    </w:p>
-    <w:p>
-      <w:pPr>
         <w:jc w:val="left"/>
       </w:pPr>
       <w:r>
@@ -2297,12 +3325,29 @@
       <w:pPr>
         <w:pStyle w:val="Ttulo2"/>
       </w:pPr>
-      <w:bookmarkStart w:id="7" w:name="_Toc217920026"/>
+      <w:bookmarkStart w:id="15" w:name="_Toc221299576"/>
       <w:r>
         <w:lastRenderedPageBreak/>
         <w:t>Resultados</w:t>
       </w:r>
-      <w:bookmarkEnd w:id="7"/>
+      <w:bookmarkEnd w:id="15"/>
+    </w:p>
+    <w:p>
+      <w:r>
+        <w:t>O resultado do proxecto foi un prototipo capaz de realizar as operación necesarias para o estudo do comportamento de diferentes materiais respecto aos cambios de temperatura, intensidade luminosa e humidade. O prototipo conta c</w:t>
+      </w:r>
+      <w:r>
+        <w:t xml:space="preserve">oa </w:t>
+      </w:r>
+      <w:r>
+        <w:t>capacidade illante</w:t>
+      </w:r>
+      <w:r>
+        <w:t xml:space="preserve"> necesaria</w:t>
+      </w:r>
+      <w:r>
+        <w:t xml:space="preserve"> e o sistema electrónico é perfectamente capaz de tomar os datos necesarios para estudar o seu impacto no interior da maqueta.</w:t>
+      </w:r>
       <w:r>
         <w:br w:type="page"/>
       </w:r>
@@ -2311,26 +3356,12 @@
       <w:pPr>
         <w:pStyle w:val="Ttulo2"/>
       </w:pPr>
-      <w:bookmarkStart w:id="8" w:name="_Toc217920027"/>
-      <w:r>
-        <w:lastRenderedPageBreak/>
-        <w:t>Discusión</w:t>
-      </w:r>
-      <w:bookmarkEnd w:id="8"/>
-      <w:r>
-        <w:br w:type="page"/>
-      </w:r>
-    </w:p>
-    <w:p>
-      <w:pPr>
-        <w:pStyle w:val="Ttulo2"/>
-      </w:pPr>
-      <w:bookmarkStart w:id="9" w:name="_Toc217920028"/>
+      <w:bookmarkStart w:id="16" w:name="_Toc221299577"/>
       <w:r>
         <w:lastRenderedPageBreak/>
         <w:t>Conclusións</w:t>
       </w:r>
-      <w:bookmarkEnd w:id="9"/>
+      <w:bookmarkEnd w:id="16"/>
     </w:p>
     <w:p>
       <w:pPr>
@@ -2340,22 +3371,21 @@
         <w:br w:type="page"/>
       </w:r>
     </w:p>
+    <w:bookmarkStart w:id="17" w:name="_Toc221299578" w:displacedByCustomXml="next"/>
     <w:sdt>
       <w:sdtPr>
+        <w:rPr>
+          <w:rFonts w:ascii="Arial" w:eastAsia="NSimSun" w:hAnsi="Arial"/>
+          <w:bCs w:val="0"/>
+          <w:sz w:val="24"/>
+          <w:szCs w:val="24"/>
+        </w:rPr>
         <w:id w:val="-350486351"/>
         <w:docPartObj>
           <w:docPartGallery w:val="Bibliographies"/>
           <w:docPartUnique/>
         </w:docPartObj>
       </w:sdtPr>
-      <w:sdtEndPr>
-        <w:rPr>
-          <w:rFonts w:ascii="Arial" w:eastAsia="NSimSun" w:hAnsi="Arial"/>
-          <w:bCs w:val="0"/>
-          <w:sz w:val="24"/>
-          <w:szCs w:val="24"/>
-        </w:rPr>
-      </w:sdtEndPr>
       <w:sdtContent>
         <w:p>
           <w:pPr>
@@ -2364,18 +3394,17 @@
           <w:r>
             <w:t>Bibliografía</w:t>
           </w:r>
+          <w:bookmarkEnd w:id="17"/>
         </w:p>
         <w:sdt>
           <w:sdtPr>
-            <w:id w:val="111145805"/>
-            <w:bibliography/>
-          </w:sdtPr>
-          <w:sdtEndPr>
             <w:rPr>
               <w:rFonts w:cs="Lucida Sans"/>
               <w:szCs w:val="24"/>
             </w:rPr>
-          </w:sdtEndPr>
+            <w:id w:val="111145805"/>
+            <w:bibliography/>
+          </w:sdtPr>
           <w:sdtContent>
             <w:p>
               <w:pPr>
@@ -2396,6 +3425,21 @@
               <w:r>
                 <w:fldChar w:fldCharType="separate"/>
               </w:r>
+              <w:r>
+                <w:rPr>
+                  <w:noProof/>
+                </w:rPr>
+                <w:t>Adafruit Industries. (22 de xaneiro de 2025). DHT11, DHT22 and AM2302 Sensors.</w:t>
+              </w:r>
+            </w:p>
+            <w:p>
+              <w:pPr>
+                <w:pStyle w:val="Bibliografa"/>
+                <w:ind w:left="720" w:hanging="720"/>
+                <w:rPr>
+                  <w:noProof/>
+                </w:rPr>
+              </w:pPr>
               <w:r>
                 <w:rPr>
                   <w:noProof/>
@@ -2476,6 +3520,80 @@
               </w:r>
             </w:p>
             <w:p>
+              <w:pPr>
+                <w:pStyle w:val="Bibliografa"/>
+                <w:ind w:left="720" w:hanging="720"/>
+                <w:rPr>
+                  <w:noProof/>
+                </w:rPr>
+              </w:pPr>
+              <w:r>
+                <w:rPr>
+                  <w:noProof/>
+                </w:rPr>
+                <w:t>Maxim Integrated Products. (2021). MAX6675 Data Sheet.</w:t>
+              </w:r>
+            </w:p>
+            <w:p>
+              <w:pPr>
+                <w:pStyle w:val="Bibliografa"/>
+                <w:ind w:left="720" w:hanging="720"/>
+                <w:rPr>
+                  <w:noProof/>
+                </w:rPr>
+              </w:pPr>
+              <w:r>
+                <w:rPr>
+                  <w:noProof/>
+                </w:rPr>
+                <w:t>OSEPP Electronics. (s.d.). DHT11 Humidity &amp; Temperature Sensor – Technical Data Sheet.</w:t>
+              </w:r>
+            </w:p>
+            <w:p>
+              <w:pPr>
+                <w:pStyle w:val="Bibliografa"/>
+                <w:ind w:left="720" w:hanging="720"/>
+                <w:rPr>
+                  <w:noProof/>
+                </w:rPr>
+              </w:pPr>
+              <w:r>
+                <w:rPr>
+                  <w:noProof/>
+                </w:rPr>
+                <w:t>Soldered. (s.d.). Waterproof DS18B20 Temperature Sensor Datasheet.</w:t>
+              </w:r>
+            </w:p>
+            <w:p>
+              <w:pPr>
+                <w:pStyle w:val="Bibliografa"/>
+                <w:ind w:left="720" w:hanging="720"/>
+                <w:rPr>
+                  <w:noProof/>
+                </w:rPr>
+              </w:pPr>
+              <w:r>
+                <w:rPr>
+                  <w:noProof/>
+                </w:rPr>
+                <w:t xml:space="preserve">Zamora Martínez, M. C. (2015). </w:t>
+              </w:r>
+              <w:r>
+                <w:rPr>
+                  <w:i/>
+                  <w:iCs/>
+                  <w:noProof/>
+                </w:rPr>
+                <w:t>Cambio climático. Revista mexicana de ciencias forestales.</w:t>
+              </w:r>
+              <w:r>
+                <w:rPr>
+                  <w:noProof/>
+                </w:rPr>
+                <w:t xml:space="preserve"> Obtido de http://www.scielo.org.mx/scielo.php?script=sci_arttext&amp;pid=S2007-11322015000500001&amp;lng=es&amp;tlng=es</w:t>
+              </w:r>
+            </w:p>
+            <w:p>
               <w:r>
                 <w:rPr>
                   <w:b/>
@@ -2492,9 +3610,11 @@
       <w:pPr>
         <w:pStyle w:val="Ttulo2"/>
       </w:pPr>
+      <w:bookmarkStart w:id="18" w:name="_Toc221299579"/>
       <w:r>
         <w:t>Ecuacións</w:t>
       </w:r>
+      <w:bookmarkEnd w:id="18"/>
     </w:p>
     <w:p>
       <w:pPr>
@@ -2503,7 +3623,11 @@
           <w:tab w:val="right" w:leader="dot" w:pos="9628"/>
         </w:tabs>
         <w:rPr>
+          <w:rFonts w:asciiTheme="minorHAnsi" w:eastAsiaTheme="minorEastAsia" w:hAnsiTheme="minorHAnsi" w:cstheme="minorBidi"/>
           <w:noProof/>
+          <w:szCs w:val="24"/>
+          <w:lang w:val="es-ES" w:eastAsia="es-ES" w:bidi="ar-SA"/>
+          <w14:ligatures w14:val="standardContextual"/>
         </w:rPr>
       </w:pPr>
       <w:r>
@@ -2515,13 +3639,13 @@
       <w:r>
         <w:fldChar w:fldCharType="separate"/>
       </w:r>
-      <w:hyperlink w:anchor="_Toc220770995" w:history="1">
+      <w:hyperlink w:anchor="_Toc221299257" w:history="1">
         <w:r>
           <w:rPr>
             <w:rStyle w:val="Hiperligazn"/>
             <w:noProof/>
           </w:rPr>
-          <w:t>Ecuación 1</w:t>
+          <w:t>Ecuación 1: Calor cedido por convección</w:t>
         </w:r>
         <w:r>
           <w:rPr>
@@ -2542,7 +3666,7 @@
             <w:noProof/>
             <w:webHidden/>
           </w:rPr>
-          <w:instrText xml:space="preserve"> PAGEREF _Toc220770995 \h </w:instrText>
+          <w:instrText xml:space="preserve"> PAGEREF _Toc221299257 \h </w:instrText>
         </w:r>
         <w:r>
           <w:rPr>
@@ -2574,10 +3698,192 @@
       </w:hyperlink>
     </w:p>
     <w:p>
+      <w:pPr>
+        <w:pStyle w:val="Tboadeilustracins"/>
+        <w:tabs>
+          <w:tab w:val="right" w:leader="dot" w:pos="9628"/>
+        </w:tabs>
+        <w:rPr>
+          <w:rFonts w:asciiTheme="minorHAnsi" w:eastAsiaTheme="minorEastAsia" w:hAnsiTheme="minorHAnsi" w:cstheme="minorBidi"/>
+          <w:noProof/>
+          <w:szCs w:val="24"/>
+          <w:lang w:val="es-ES" w:eastAsia="es-ES" w:bidi="ar-SA"/>
+          <w14:ligatures w14:val="standardContextual"/>
+        </w:rPr>
+      </w:pPr>
+      <w:hyperlink w:anchor="_Toc221299258" w:history="1">
+        <w:r>
+          <w:rPr>
+            <w:rStyle w:val="Hiperligazn"/>
+            <w:noProof/>
+          </w:rPr>
+          <w:t>Ecuación 2: Calor cedido por radiación</w:t>
+        </w:r>
+        <w:r>
+          <w:rPr>
+            <w:noProof/>
+            <w:webHidden/>
+          </w:rPr>
+          <w:tab/>
+        </w:r>
+        <w:r>
+          <w:rPr>
+            <w:noProof/>
+            <w:webHidden/>
+          </w:rPr>
+          <w:fldChar w:fldCharType="begin"/>
+        </w:r>
+        <w:r>
+          <w:rPr>
+            <w:noProof/>
+            <w:webHidden/>
+          </w:rPr>
+          <w:instrText xml:space="preserve"> PAGEREF _Toc221299258 \h </w:instrText>
+        </w:r>
+        <w:r>
+          <w:rPr>
+            <w:noProof/>
+            <w:webHidden/>
+          </w:rPr>
+        </w:r>
+        <w:r>
+          <w:rPr>
+            <w:noProof/>
+            <w:webHidden/>
+          </w:rPr>
+          <w:fldChar w:fldCharType="separate"/>
+        </w:r>
+        <w:r>
+          <w:rPr>
+            <w:noProof/>
+            <w:webHidden/>
+          </w:rPr>
+          <w:t>6</w:t>
+        </w:r>
+        <w:r>
+          <w:rPr>
+            <w:noProof/>
+            <w:webHidden/>
+          </w:rPr>
+          <w:fldChar w:fldCharType="end"/>
+        </w:r>
+      </w:hyperlink>
+    </w:p>
+    <w:p>
+      <w:pPr>
+        <w:pStyle w:val="Tboadeilustracins"/>
+        <w:tabs>
+          <w:tab w:val="right" w:leader="dot" w:pos="9628"/>
+        </w:tabs>
+        <w:rPr>
+          <w:rFonts w:asciiTheme="minorHAnsi" w:eastAsiaTheme="minorEastAsia" w:hAnsiTheme="minorHAnsi" w:cstheme="minorBidi"/>
+          <w:noProof/>
+          <w:szCs w:val="24"/>
+          <w:lang w:val="es-ES" w:eastAsia="es-ES" w:bidi="ar-SA"/>
+          <w14:ligatures w14:val="standardContextual"/>
+        </w:rPr>
+      </w:pPr>
+      <w:hyperlink w:anchor="_Toc221299259" w:history="1">
+        <w:r>
+          <w:rPr>
+            <w:rStyle w:val="Hiperligazn"/>
+            <w:noProof/>
+          </w:rPr>
+          <w:t>Ecuación 3: Fluxo en radiación</w:t>
+        </w:r>
+        <w:r>
+          <w:rPr>
+            <w:noProof/>
+            <w:webHidden/>
+          </w:rPr>
+          <w:tab/>
+        </w:r>
+        <w:r>
+          <w:rPr>
+            <w:noProof/>
+            <w:webHidden/>
+          </w:rPr>
+          <w:fldChar w:fldCharType="begin"/>
+        </w:r>
+        <w:r>
+          <w:rPr>
+            <w:noProof/>
+            <w:webHidden/>
+          </w:rPr>
+          <w:instrText xml:space="preserve"> PAGEREF _Toc221299259 \h </w:instrText>
+        </w:r>
+        <w:r>
+          <w:rPr>
+            <w:noProof/>
+            <w:webHidden/>
+          </w:rPr>
+        </w:r>
+        <w:r>
+          <w:rPr>
+            <w:noProof/>
+            <w:webHidden/>
+          </w:rPr>
+          <w:fldChar w:fldCharType="separate"/>
+        </w:r>
+        <w:r>
+          <w:rPr>
+            <w:noProof/>
+            <w:webHidden/>
+          </w:rPr>
+          <w:t>6</w:t>
+        </w:r>
+        <w:r>
+          <w:rPr>
+            <w:noProof/>
+            <w:webHidden/>
+          </w:rPr>
+          <w:fldChar w:fldCharType="end"/>
+        </w:r>
+      </w:hyperlink>
+    </w:p>
+    <w:p>
       <w:r>
         <w:fldChar w:fldCharType="end"/>
       </w:r>
     </w:p>
+    <w:p>
+      <w:pPr>
+        <w:pStyle w:val="Ttulo1"/>
+      </w:pPr>
+      <w:r>
+        <w:t>Apéndices</w:t>
+      </w:r>
+    </w:p>
+    <w:p>
+      <w:r>
+        <w:t xml:space="preserve">Apéndice A: Código de </w:t>
+      </w:r>
+      <w:proofErr w:type="spellStart"/>
+      <w:r>
+        <w:t>arduino</w:t>
+      </w:r>
+      <w:proofErr w:type="spellEnd"/>
+      <w:r>
+        <w:t>.</w:t>
+      </w:r>
+    </w:p>
+    <w:p>
+      <w:r>
+        <w:t>Apéndice B:</w:t>
+      </w:r>
+      <w:r>
+        <w:t xml:space="preserve"> Especificacións do material illante</w:t>
+      </w:r>
+    </w:p>
+    <w:p>
+      <w:r>
+        <w:t>Apéndice C:</w:t>
+      </w:r>
+      <w:r>
+        <w:t xml:space="preserve"> Descrición da cortadora láser</w:t>
+      </w:r>
+    </w:p>
+    <w:p/>
     <w:sectPr>
       <w:footerReference w:type="default" r:id="rId8"/>
       <w:pgSz w:w="11906" w:h="16838"/>
@@ -2747,6 +4053,25 @@
       </w:r>
     </w:p>
   </w:footnote>
+  <w:footnote w:id="2">
+    <w:p>
+      <w:pPr>
+        <w:pStyle w:val="Textodenotaaopdepxina"/>
+      </w:pPr>
+      <w:r>
+        <w:rPr>
+          <w:rStyle w:val="Referenciadenotaaopdepxina"/>
+        </w:rPr>
+        <w:footnoteRef/>
+      </w:r>
+      <w:r>
+        <w:t xml:space="preserve"> </w:t>
+      </w:r>
+      <w:r>
+        <w:t>https://www.makercase.com/</w:t>
+      </w:r>
+    </w:p>
+  </w:footnote>
 </w:footnotes>
 </file>
 
@@ -2866,6 +4191,92 @@
     </w:lvl>
   </w:abstractNum>
   <w:abstractNum w:abstractNumId="1" w15:restartNumberingAfterBreak="0">
+    <w:nsid w:val="0A175759"/>
+    <w:multiLevelType w:val="hybridMultilevel"/>
+    <w:tmpl w:val="E688B220"/>
+    <w:lvl w:ilvl="0" w:tplc="0C0A000F">
+      <w:start w:val="1"/>
+      <w:numFmt w:val="decimal"/>
+      <w:lvlText w:val="%1."/>
+      <w:lvlJc w:val="left"/>
+      <w:pPr>
+        <w:ind w:left="1069" w:hanging="360"/>
+      </w:pPr>
+    </w:lvl>
+    <w:lvl w:ilvl="1" w:tplc="0C0A0019" w:tentative="1">
+      <w:start w:val="1"/>
+      <w:numFmt w:val="lowerLetter"/>
+      <w:lvlText w:val="%2."/>
+      <w:lvlJc w:val="left"/>
+      <w:pPr>
+        <w:ind w:left="1789" w:hanging="360"/>
+      </w:pPr>
+    </w:lvl>
+    <w:lvl w:ilvl="2" w:tplc="0C0A001B" w:tentative="1">
+      <w:start w:val="1"/>
+      <w:numFmt w:val="lowerRoman"/>
+      <w:lvlText w:val="%3."/>
+      <w:lvlJc w:val="right"/>
+      <w:pPr>
+        <w:ind w:left="2509" w:hanging="180"/>
+      </w:pPr>
+    </w:lvl>
+    <w:lvl w:ilvl="3" w:tplc="0C0A000F" w:tentative="1">
+      <w:start w:val="1"/>
+      <w:numFmt w:val="decimal"/>
+      <w:lvlText w:val="%4."/>
+      <w:lvlJc w:val="left"/>
+      <w:pPr>
+        <w:ind w:left="3229" w:hanging="360"/>
+      </w:pPr>
+    </w:lvl>
+    <w:lvl w:ilvl="4" w:tplc="0C0A0019" w:tentative="1">
+      <w:start w:val="1"/>
+      <w:numFmt w:val="lowerLetter"/>
+      <w:lvlText w:val="%5."/>
+      <w:lvlJc w:val="left"/>
+      <w:pPr>
+        <w:ind w:left="3949" w:hanging="360"/>
+      </w:pPr>
+    </w:lvl>
+    <w:lvl w:ilvl="5" w:tplc="0C0A001B" w:tentative="1">
+      <w:start w:val="1"/>
+      <w:numFmt w:val="lowerRoman"/>
+      <w:lvlText w:val="%6."/>
+      <w:lvlJc w:val="right"/>
+      <w:pPr>
+        <w:ind w:left="4669" w:hanging="180"/>
+      </w:pPr>
+    </w:lvl>
+    <w:lvl w:ilvl="6" w:tplc="0C0A000F" w:tentative="1">
+      <w:start w:val="1"/>
+      <w:numFmt w:val="decimal"/>
+      <w:lvlText w:val="%7."/>
+      <w:lvlJc w:val="left"/>
+      <w:pPr>
+        <w:ind w:left="5389" w:hanging="360"/>
+      </w:pPr>
+    </w:lvl>
+    <w:lvl w:ilvl="7" w:tplc="0C0A0019" w:tentative="1">
+      <w:start w:val="1"/>
+      <w:numFmt w:val="lowerLetter"/>
+      <w:lvlText w:val="%8."/>
+      <w:lvlJc w:val="left"/>
+      <w:pPr>
+        <w:ind w:left="6109" w:hanging="360"/>
+      </w:pPr>
+    </w:lvl>
+    <w:lvl w:ilvl="8" w:tplc="0C0A001B" w:tentative="1">
+      <w:start w:val="1"/>
+      <w:numFmt w:val="lowerRoman"/>
+      <w:lvlText w:val="%9."/>
+      <w:lvlJc w:val="right"/>
+      <w:pPr>
+        <w:ind w:left="6829" w:hanging="180"/>
+      </w:pPr>
+    </w:lvl>
+  </w:abstractNum>
+  <w:abstractNum w:abstractNumId="2" w15:restartNumberingAfterBreak="0">
     <w:nsid w:val="0B8B7BA0"/>
     <w:multiLevelType w:val="multilevel"/>
     <w:tmpl w:val="97F65A66"/>
@@ -2993,7 +4404,7 @@
       </w:pPr>
     </w:lvl>
   </w:abstractNum>
-  <w:abstractNum w:abstractNumId="2" w15:restartNumberingAfterBreak="0">
+  <w:abstractNum w:abstractNumId="3" w15:restartNumberingAfterBreak="0">
     <w:nsid w:val="38A260C7"/>
     <w:multiLevelType w:val="hybridMultilevel"/>
     <w:tmpl w:val="07326AB8"/>
@@ -3079,7 +4490,7 @@
       </w:pPr>
     </w:lvl>
   </w:abstractNum>
-  <w:abstractNum w:abstractNumId="3" w15:restartNumberingAfterBreak="0">
+  <w:abstractNum w:abstractNumId="4" w15:restartNumberingAfterBreak="0">
     <w:nsid w:val="3CCA5052"/>
     <w:multiLevelType w:val="hybridMultilevel"/>
     <w:tmpl w:val="59684182"/>
@@ -3192,7 +4603,7 @@
       </w:rPr>
     </w:lvl>
   </w:abstractNum>
-  <w:abstractNum w:abstractNumId="4" w15:restartNumberingAfterBreak="0">
+  <w:abstractNum w:abstractNumId="5" w15:restartNumberingAfterBreak="0">
     <w:nsid w:val="488A0CE5"/>
     <w:multiLevelType w:val="hybridMultilevel"/>
     <w:tmpl w:val="CD8E4592"/>
@@ -3278,7 +4689,7 @@
       </w:pPr>
     </w:lvl>
   </w:abstractNum>
-  <w:abstractNum w:abstractNumId="5" w15:restartNumberingAfterBreak="0">
+  <w:abstractNum w:abstractNumId="6" w15:restartNumberingAfterBreak="0">
     <w:nsid w:val="4AE97F8F"/>
     <w:multiLevelType w:val="hybridMultilevel"/>
     <w:tmpl w:val="F196872A"/>
@@ -3391,7 +4802,7 @@
       </w:rPr>
     </w:lvl>
   </w:abstractNum>
-  <w:abstractNum w:abstractNumId="6" w15:restartNumberingAfterBreak="0">
+  <w:abstractNum w:abstractNumId="7" w15:restartNumberingAfterBreak="0">
     <w:nsid w:val="4F431358"/>
     <w:multiLevelType w:val="multilevel"/>
     <w:tmpl w:val="81A89488"/>
@@ -3504,7 +4915,7 @@
       </w:pPr>
     </w:lvl>
   </w:abstractNum>
-  <w:abstractNum w:abstractNumId="7" w15:restartNumberingAfterBreak="0">
+  <w:abstractNum w:abstractNumId="8" w15:restartNumberingAfterBreak="0">
     <w:nsid w:val="5E0F3E70"/>
     <w:multiLevelType w:val="multilevel"/>
     <w:tmpl w:val="97F65A66"/>
@@ -3627,7 +5038,7 @@
       </w:pPr>
     </w:lvl>
   </w:abstractNum>
-  <w:abstractNum w:abstractNumId="8" w15:restartNumberingAfterBreak="0">
+  <w:abstractNum w:abstractNumId="9" w15:restartNumberingAfterBreak="0">
     <w:nsid w:val="670C03BF"/>
     <w:multiLevelType w:val="hybridMultilevel"/>
     <w:tmpl w:val="C7CA369C"/>
@@ -3713,7 +5124,7 @@
       </w:pPr>
     </w:lvl>
   </w:abstractNum>
-  <w:abstractNum w:abstractNumId="9" w15:restartNumberingAfterBreak="0">
+  <w:abstractNum w:abstractNumId="10" w15:restartNumberingAfterBreak="0">
     <w:nsid w:val="6AE22555"/>
     <w:multiLevelType w:val="hybridMultilevel"/>
     <w:tmpl w:val="AC386110"/>
@@ -3799,7 +5210,7 @@
       </w:pPr>
     </w:lvl>
   </w:abstractNum>
-  <w:abstractNum w:abstractNumId="10" w15:restartNumberingAfterBreak="0">
+  <w:abstractNum w:abstractNumId="11" w15:restartNumberingAfterBreak="0">
     <w:nsid w:val="72F16981"/>
     <w:multiLevelType w:val="hybridMultilevel"/>
     <w:tmpl w:val="BE207654"/>
@@ -3912,7 +5323,7 @@
       </w:rPr>
     </w:lvl>
   </w:abstractNum>
-  <w:abstractNum w:abstractNumId="11" w15:restartNumberingAfterBreak="0">
+  <w:abstractNum w:abstractNumId="12" w15:restartNumberingAfterBreak="0">
     <w:nsid w:val="79B02F47"/>
     <w:multiLevelType w:val="hybridMultilevel"/>
     <w:tmpl w:val="FCA6050C"/>
@@ -3999,40 +5410,43 @@
     </w:lvl>
   </w:abstractNum>
   <w:num w:numId="1" w16cid:durableId="775055822">
-    <w:abstractNumId w:val="1"/>
+    <w:abstractNumId w:val="2"/>
   </w:num>
   <w:num w:numId="2" w16cid:durableId="222521324">
-    <w:abstractNumId w:val="6"/>
+    <w:abstractNumId w:val="7"/>
   </w:num>
   <w:num w:numId="3" w16cid:durableId="1066799841">
     <w:abstractNumId w:val="0"/>
   </w:num>
   <w:num w:numId="4" w16cid:durableId="973826684">
+    <w:abstractNumId w:val="11"/>
+  </w:num>
+  <w:num w:numId="5" w16cid:durableId="307363977">
+    <w:abstractNumId w:val="4"/>
+  </w:num>
+  <w:num w:numId="6" w16cid:durableId="20908607">
+    <w:abstractNumId w:val="6"/>
+  </w:num>
+  <w:num w:numId="7" w16cid:durableId="968705804">
+    <w:abstractNumId w:val="9"/>
+  </w:num>
+  <w:num w:numId="8" w16cid:durableId="187985308">
+    <w:abstractNumId w:val="3"/>
+  </w:num>
+  <w:num w:numId="9" w16cid:durableId="32929892">
     <w:abstractNumId w:val="10"/>
   </w:num>
-  <w:num w:numId="5" w16cid:durableId="307363977">
-    <w:abstractNumId w:val="3"/>
+  <w:num w:numId="10" w16cid:durableId="2061203820">
+    <w:abstractNumId w:val="12"/>
   </w:num>
-  <w:num w:numId="6" w16cid:durableId="20908607">
+  <w:num w:numId="11" w16cid:durableId="185604072">
     <w:abstractNumId w:val="5"/>
   </w:num>
-  <w:num w:numId="7" w16cid:durableId="968705804">
+  <w:num w:numId="12" w16cid:durableId="232784240">
     <w:abstractNumId w:val="8"/>
   </w:num>
-  <w:num w:numId="8" w16cid:durableId="187985308">
-    <w:abstractNumId w:val="2"/>
-  </w:num>
-  <w:num w:numId="9" w16cid:durableId="32929892">
-    <w:abstractNumId w:val="9"/>
-  </w:num>
-  <w:num w:numId="10" w16cid:durableId="2061203820">
-    <w:abstractNumId w:val="11"/>
-  </w:num>
-  <w:num w:numId="11" w16cid:durableId="185604072">
-    <w:abstractNumId w:val="4"/>
-  </w:num>
-  <w:num w:numId="12" w16cid:durableId="232784240">
-    <w:abstractNumId w:val="7"/>
+  <w:num w:numId="13" w16cid:durableId="1910000521">
+    <w:abstractNumId w:val="1"/>
   </w:num>
 </w:numbering>
 </file>
@@ -4510,7 +5924,6 @@
   <w:style w:type="character" w:default="1" w:styleId="Tipodeletrapredefinidodopargrafo">
     <w:name w:val="Default Paragraph Font"/>
     <w:uiPriority w:val="1"/>
-    <w:semiHidden/>
     <w:unhideWhenUsed/>
   </w:style>
   <w:style w:type="table" w:default="1" w:styleId="Tboanormal">
@@ -5094,6 +6507,30 @@
       <w:szCs w:val="21"/>
     </w:rPr>
   </w:style>
+  <w:style w:type="character" w:styleId="Mencinnonresolta">
+    <w:name w:val="Unresolved Mention"/>
+    <w:basedOn w:val="Tipodeletrapredefinidodopargrafo"/>
+    <w:uiPriority w:val="99"/>
+    <w:semiHidden/>
+    <w:unhideWhenUsed/>
+    <w:rsid w:val="00E171B0"/>
+    <w:rPr>
+      <w:color w:val="605E5C"/>
+      <w:shd w:val="clear" w:color="auto" w:fill="E1DFDD"/>
+    </w:rPr>
+  </w:style>
+  <w:style w:type="character" w:styleId="Ligaznvisitada">
+    <w:name w:val="FollowedHyperlink"/>
+    <w:basedOn w:val="Tipodeletrapredefinidodopargrafo"/>
+    <w:uiPriority w:val="99"/>
+    <w:semiHidden/>
+    <w:unhideWhenUsed/>
+    <w:rsid w:val="00E171B0"/>
+    <w:rPr>
+      <w:color w:val="551A8B" w:themeColor="followedHyperlink"/>
+      <w:u w:val="single"/>
+    </w:rPr>
+  </w:style>
 </w:styles>
 </file>
 
@@ -5282,11 +6719,64 @@
     <b:URL>http://www.scielo.org.mx/scielo.php?script=sci_arttext&amp;pid=S2007-11322015000500001&amp;lng=es&amp;tlng=es</b:URL>
     <b:RefOrder>2</b:RefOrder>
   </b:Source>
+  <b:Source>
+    <b:Tag>DHT22</b:Tag>
+    <b:SourceType>Misc</b:SourceType>
+    <b:Guid>{92325406-22CE-456D-A105-4BA674EE0AB8}</b:Guid>
+    <b:Author>
+      <b:Author>
+        <b:Corporate>Adafruit Industries</b:Corporate>
+      </b:Author>
+    </b:Author>
+    <b:Title>DHT11, DHT22 and AM2302 Sensors</b:Title>
+    <b:Year>2025</b:Year>
+    <b:Month>xaneiro</b:Month>
+    <b:Day>22</b:Day>
+    <b:RefOrder>6</b:RefOrder>
+  </b:Source>
+  <b:Source>
+    <b:Tag>DS18B20</b:Tag>
+    <b:SourceType>Misc</b:SourceType>
+    <b:Guid>{2503BA16-8594-46EC-9E8F-836249DBF5D7}</b:Guid>
+    <b:Author>
+      <b:Author>
+        <b:Corporate>Soldered</b:Corporate>
+      </b:Author>
+    </b:Author>
+    <b:Title>Waterproof DS18B20 Temperature Sensor Datasheet</b:Title>
+    <b:RefOrder>7</b:RefOrder>
+  </b:Source>
+  <b:Source>
+    <b:Tag>MAX6675</b:Tag>
+    <b:SourceType>Misc</b:SourceType>
+    <b:Guid>{B725AF0C-5E19-4EF1-8BE4-1B49A2276317}</b:Guid>
+    <b:Author>
+      <b:Author>
+        <b:Corporate>Maxim Integrated Products</b:Corporate>
+      </b:Author>
+    </b:Author>
+    <b:Title>MAX6675 Data Sheet</b:Title>
+    <b:Year>2021</b:Year>
+    <b:RefOrder>8</b:RefOrder>
+  </b:Source>
+  <b:Source>
+    <b:Tag>DHT11</b:Tag>
+    <b:SourceType>Misc</b:SourceType>
+    <b:Guid>{F8DA2F1D-8D0B-40DA-87FB-F4CA4864716D}</b:Guid>
+    <b:Title>DHT11 Humidity &amp; Temperature Sensor – Technical Data Sheet</b:Title>
+    <b:Author>
+      <b:Author>
+        <b:Corporate>OSEPP Electronics</b:Corporate>
+      </b:Author>
+    </b:Author>
+    <b:LCID>gl-ES</b:LCID>
+    <b:RefOrder>5</b:RefOrder>
+  </b:Source>
 </b:Sources>
 </file>
 
 <file path=customXml/itemProps1.xml><?xml version="1.0" encoding="utf-8"?>
-<ds:datastoreItem xmlns:ds="http://schemas.openxmlformats.org/officeDocument/2006/customXml" ds:itemID="{37350A32-C427-4772-900E-A9BCAE5951B2}">
+<ds:datastoreItem xmlns:ds="http://schemas.openxmlformats.org/officeDocument/2006/customXml" ds:itemID="{3AD2864E-3E9B-49E5-8FF3-AE510F9B537D}">
   <ds:schemaRefs>
     <ds:schemaRef ds:uri="http://schemas.openxmlformats.org/officeDocument/2006/bibliography"/>
   </ds:schemaRefs>

</xml_diff>